<commit_message>
Documentación del entorno de IA (docs/uso_ia.md), sección 7 de la memoria y registro IA-007
Co-Authored-By: Claude Opus 5.5 <noreply@anthropic.com>
Claude-Session: https://claude.ai/code/session_01MGcbUB4LTJrt847y66pmRH
</commit_message>
<xml_diff>
--- a/docs/memoria/TFM_Agua_y_vinedo_La_Rioja.docx
+++ b/docs/memoria/TFM_Agua_y_vinedo_La_Rioja.docx
@@ -962,6 +962,66 @@
                 <w:szCs w:val="17"/>
               </w:rPr>
               <w:t xml:space="preserve">Fig. 10, 11</w:t>
+            </w:r>
+          </w:p>
+        </w:tc>
+      </w:tr>
+      <w:tr>
+        <w:tc>
+          <w:tcPr>
+            <w:tcW w:type="dxa" w:w="6900"/>
+            <w:tcBorders>
+              <w:top w:val="single" w:color="C9C9C9" w:sz="4"/>
+              <w:left w:val="single" w:color="C9C9C9" w:sz="4"/>
+              <w:bottom w:val="single" w:color="C9C9C9" w:sz="4"/>
+              <w:right w:val="single" w:color="C9C9C9" w:sz="4"/>
+            </w:tcBorders>
+            <w:tcMar>
+              <w:top w:type="dxa" w:w="50"/>
+              <w:left w:type="dxa" w:w="90"/>
+              <w:bottom w:type="dxa" w:w="50"/>
+              <w:right w:type="dxa" w:w="90"/>
+            </w:tcMar>
+          </w:tcPr>
+          <w:p>
+            <w:r>
+              <w:rPr>
+                <w:rFonts w:ascii="Arial" w:cs="Arial" w:eastAsia="Arial" w:hAnsi="Arial"/>
+                <w:b w:val="false"/>
+                <w:bCs w:val="false"/>
+                <w:sz w:val="17"/>
+                <w:szCs w:val="17"/>
+              </w:rPr>
+              <w:t xml:space="preserve">Uso de IA con reglas, controles y errores detectados</w:t>
+            </w:r>
+          </w:p>
+        </w:tc>
+        <w:tc>
+          <w:tcPr>
+            <w:tcW w:type="dxa" w:w="2738"/>
+            <w:tcBorders>
+              <w:top w:val="single" w:color="C9C9C9" w:sz="4"/>
+              <w:left w:val="single" w:color="C9C9C9" w:sz="4"/>
+              <w:bottom w:val="single" w:color="C9C9C9" w:sz="4"/>
+              <w:right w:val="single" w:color="C9C9C9" w:sz="4"/>
+            </w:tcBorders>
+            <w:tcMar>
+              <w:top w:type="dxa" w:w="50"/>
+              <w:left w:type="dxa" w:w="90"/>
+              <w:bottom w:type="dxa" w:w="50"/>
+              <w:right w:type="dxa" w:w="90"/>
+            </w:tcMar>
+          </w:tcPr>
+          <w:p>
+            <w:r>
+              <w:rPr>
+                <w:rFonts w:ascii="Arial" w:cs="Arial" w:eastAsia="Arial" w:hAnsi="Arial"/>
+                <w:b w:val="false"/>
+                <w:bCs w:val="false"/>
+                <w:sz w:val="17"/>
+                <w:szCs w:val="17"/>
+              </w:rPr>
+              <w:t xml:space="preserve">Sección 7</w:t>
             </w:r>
           </w:p>
         </w:tc>
@@ -7571,7 +7631,7 @@
           <w:sz w:val="20"/>
           <w:szCs w:val="20"/>
         </w:rPr>
-        <w:t xml:space="preserve">Los grados-día de Logroño (≈ 1.950–2.380 en 2022–2026) parecen altos frente a la clasificación clásica de Rioja. Puede deberse al calentamiento reciente o a que una sola estación de valle no representa toda la DOCa: </w:t>
+        <w:t xml:space="preserve">Los grados-día de Logroño (≈ 1.950–2.380 en 2022–2026) parecen altos frente a la clasificación clásica de Rioja. </w:t>
       </w:r>
       <w:r>
         <w:rPr>
@@ -7581,7 +7641,7 @@
           <w:sz w:val="20"/>
           <w:szCs w:val="20"/>
         </w:rPr>
-        <w:t xml:space="preserve">no está contrastado con bibliografía</w:t>
+        <w:t xml:space="preserve">Contraste:</w:t>
       </w:r>
       <w:r>
         <w:rPr>
@@ -7589,7 +7649,7 @@
           <w:sz w:val="20"/>
           <w:szCs w:val="20"/>
         </w:rPr>
-        <w:t xml:space="preserve">.</w:t>
+        <w:t xml:space="preserve"> el informe de índices bioclimáticos de AEMET da a Logroño 2.748 grados-día en 2021 (1 de abril–30 de septiembre, base 10 ºC, calculados con máximas y mínimas), así que el orden de magnitud es plausible. La diferencia con la referencia clásica se explica por el periodo, el método de cálculo y el calentamiento reciente; una sola estación de valle sigue sin representar toda la DOCa.</w:t>
       </w:r>
     </w:p>
     <w:p>
@@ -7739,7 +7799,1211 @@
           <w:sz w:val="28"/>
           <w:szCs w:val="28"/>
         </w:rPr>
-        <w:t xml:space="preserve">7. Justificación cuantitativa: horas y costes</w:t>
+        <w:t xml:space="preserve">7. Cómo se ha trabajado con la IA</w:t>
+      </w:r>
+    </w:p>
+    <w:p>
+      <w:pPr>
+        <w:spacing w:after="100" w:line="276"/>
+        <w:jc w:val="both"/>
+      </w:pPr>
+      <w:r>
+        <w:rPr>
+          <w:rFonts w:ascii="Arial" w:cs="Arial" w:eastAsia="Arial" w:hAnsi="Arial"/>
+          <w:sz w:val="20"/>
+          <w:szCs w:val="20"/>
+        </w:rPr>
+        <w:t xml:space="preserve">Los recuadros de cada sección dicen qué hizo la IA en ese paso. Esta sección explica </w:t>
+      </w:r>
+      <w:r>
+        <w:rPr>
+          <w:rFonts w:ascii="Arial" w:cs="Arial" w:eastAsia="Arial" w:hAnsi="Arial"/>
+          <w:b/>
+          <w:bCs/>
+          <w:sz w:val="20"/>
+          <w:szCs w:val="20"/>
+        </w:rPr>
+        <w:t xml:space="preserve">con qué entorno, con qué reglas y con qué controles</w:t>
+      </w:r>
+      <w:r>
+        <w:rPr>
+          <w:rFonts w:ascii="Arial" w:cs="Arial" w:eastAsia="Arial" w:hAnsi="Arial"/>
+          <w:sz w:val="20"/>
+          <w:szCs w:val="20"/>
+        </w:rPr>
+        <w:t xml:space="preserve"> se trabajó; el detalle está en docs/uso_ia.md y en el registro de uso de IA (IA-001 a IA-007).</w:t>
+      </w:r>
+    </w:p>
+    <w:p>
+      <w:pPr>
+        <w:pStyle w:val="Heading2"/>
+        <w:keepNext/>
+        <w:keepLines/>
+        <w:spacing w:after="80" w:before="160"/>
+      </w:pPr>
+      <w:r>
+        <w:rPr>
+          <w:rFonts w:ascii="Arial" w:cs="Arial" w:eastAsia="Arial" w:hAnsi="Arial"/>
+          <w:b/>
+          <w:bCs/>
+          <w:color w:val="333333"/>
+          <w:sz w:val="22"/>
+          <w:szCs w:val="22"/>
+        </w:rPr>
+        <w:t xml:space="preserve">Entorno, skills e instrucciones</w:t>
+      </w:r>
+    </w:p>
+    <w:tbl>
+      <w:tblPr>
+        <w:tblW w:type="dxa" w:w="9638"/>
+        <w:tblBorders>
+          <w:top w:val="single" w:color="auto" w:sz="4"/>
+          <w:left w:val="single" w:color="auto" w:sz="4"/>
+          <w:bottom w:val="single" w:color="auto" w:sz="4"/>
+          <w:right w:val="single" w:color="auto" w:sz="4"/>
+          <w:insideH w:val="single" w:color="auto" w:sz="4"/>
+          <w:insideV w:val="single" w:color="auto" w:sz="4"/>
+        </w:tblBorders>
+      </w:tblPr>
+      <w:tblGrid>
+        <w:gridCol w:w="3900"/>
+        <w:gridCol w:w="5738"/>
+      </w:tblGrid>
+      <w:tr>
+        <w:trPr>
+          <w:tblHeader/>
+        </w:trPr>
+        <w:tc>
+          <w:tcPr>
+            <w:tcW w:type="dxa" w:w="3900"/>
+            <w:tcBorders>
+              <w:top w:val="single" w:color="C9C9C9" w:sz="4"/>
+              <w:left w:val="single" w:color="C9C9C9" w:sz="4"/>
+              <w:bottom w:val="single" w:color="C9C9C9" w:sz="4"/>
+              <w:right w:val="single" w:color="C9C9C9" w:sz="4"/>
+            </w:tcBorders>
+            <w:shd w:fill="EBDDE2" w:val="clear"/>
+            <w:tcMar>
+              <w:top w:type="dxa" w:w="50"/>
+              <w:left w:type="dxa" w:w="90"/>
+              <w:bottom w:type="dxa" w:w="50"/>
+              <w:right w:type="dxa" w:w="90"/>
+            </w:tcMar>
+          </w:tcPr>
+          <w:p>
+            <w:r>
+              <w:rPr>
+                <w:rFonts w:ascii="Arial" w:cs="Arial" w:eastAsia="Arial" w:hAnsi="Arial"/>
+                <w:b/>
+                <w:bCs/>
+                <w:sz w:val="17"/>
+                <w:szCs w:val="17"/>
+              </w:rPr>
+              <w:t xml:space="preserve">Pieza</w:t>
+            </w:r>
+          </w:p>
+        </w:tc>
+        <w:tc>
+          <w:tcPr>
+            <w:tcW w:type="dxa" w:w="5738"/>
+            <w:tcBorders>
+              <w:top w:val="single" w:color="C9C9C9" w:sz="4"/>
+              <w:left w:val="single" w:color="C9C9C9" w:sz="4"/>
+              <w:bottom w:val="single" w:color="C9C9C9" w:sz="4"/>
+              <w:right w:val="single" w:color="C9C9C9" w:sz="4"/>
+            </w:tcBorders>
+            <w:shd w:fill="EBDDE2" w:val="clear"/>
+            <w:tcMar>
+              <w:top w:type="dxa" w:w="50"/>
+              <w:left w:type="dxa" w:w="90"/>
+              <w:bottom w:type="dxa" w:w="50"/>
+              <w:right w:type="dxa" w:w="90"/>
+            </w:tcMar>
+          </w:tcPr>
+          <w:p>
+            <w:r>
+              <w:rPr>
+                <w:rFonts w:ascii="Arial" w:cs="Arial" w:eastAsia="Arial" w:hAnsi="Arial"/>
+                <w:b/>
+                <w:bCs/>
+                <w:sz w:val="17"/>
+                <w:szCs w:val="17"/>
+              </w:rPr>
+              <w:t xml:space="preserve">Qué aporta al trabajo</w:t>
+            </w:r>
+          </w:p>
+        </w:tc>
+      </w:tr>
+      <w:tr>
+        <w:tc>
+          <w:tcPr>
+            <w:tcW w:type="dxa" w:w="3900"/>
+            <w:tcBorders>
+              <w:top w:val="single" w:color="C9C9C9" w:sz="4"/>
+              <w:left w:val="single" w:color="C9C9C9" w:sz="4"/>
+              <w:bottom w:val="single" w:color="C9C9C9" w:sz="4"/>
+              <w:right w:val="single" w:color="C9C9C9" w:sz="4"/>
+            </w:tcBorders>
+            <w:tcMar>
+              <w:top w:type="dxa" w:w="50"/>
+              <w:left w:type="dxa" w:w="90"/>
+              <w:bottom w:type="dxa" w:w="50"/>
+              <w:right w:type="dxa" w:w="90"/>
+            </w:tcMar>
+          </w:tcPr>
+          <w:p>
+            <w:r>
+              <w:rPr>
+                <w:rFonts w:ascii="Arial" w:cs="Arial" w:eastAsia="Arial" w:hAnsi="Arial"/>
+                <w:b/>
+                <w:bCs/>
+                <w:sz w:val="17"/>
+                <w:szCs w:val="17"/>
+              </w:rPr>
+              <w:t xml:space="preserve">Claude Opus 5.5</w:t>
+            </w:r>
+            <w:r>
+              <w:rPr>
+                <w:rFonts w:ascii="Arial" w:cs="Arial" w:eastAsia="Arial" w:hAnsi="Arial"/>
+                <w:b w:val="false"/>
+                <w:bCs w:val="false"/>
+                <w:sz w:val="17"/>
+                <w:szCs w:val="17"/>
+              </w:rPr>
+              <w:t xml:space="preserve"> (Anthropic), en la app de Claude en modo agente</w:t>
+            </w:r>
+          </w:p>
+        </w:tc>
+        <w:tc>
+          <w:tcPr>
+            <w:tcW w:type="dxa" w:w="5738"/>
+            <w:tcBorders>
+              <w:top w:val="single" w:color="C9C9C9" w:sz="4"/>
+              <w:left w:val="single" w:color="C9C9C9" w:sz="4"/>
+              <w:bottom w:val="single" w:color="C9C9C9" w:sz="4"/>
+              <w:right w:val="single" w:color="C9C9C9" w:sz="4"/>
+            </w:tcBorders>
+            <w:tcMar>
+              <w:top w:type="dxa" w:w="50"/>
+              <w:left w:type="dxa" w:w="90"/>
+              <w:bottom w:type="dxa" w:w="50"/>
+              <w:right w:type="dxa" w:w="90"/>
+            </w:tcMar>
+          </w:tcPr>
+          <w:p>
+            <w:r>
+              <w:rPr>
+                <w:rFonts w:ascii="Arial" w:cs="Arial" w:eastAsia="Arial" w:hAnsi="Arial"/>
+                <w:b w:val="false"/>
+                <w:bCs w:val="false"/>
+                <w:sz w:val="17"/>
+                <w:szCs w:val="17"/>
+              </w:rPr>
+              <w:t xml:space="preserve">Ejecuta tareas de varios pasos en un espacio de trabajo en la nube: escribe y prueba código, genera documentos y hace commits</w:t>
+            </w:r>
+          </w:p>
+        </w:tc>
+      </w:tr>
+      <w:tr>
+        <w:tc>
+          <w:tcPr>
+            <w:tcW w:type="dxa" w:w="3900"/>
+            <w:tcBorders>
+              <w:top w:val="single" w:color="C9C9C9" w:sz="4"/>
+              <w:left w:val="single" w:color="C9C9C9" w:sz="4"/>
+              <w:bottom w:val="single" w:color="C9C9C9" w:sz="4"/>
+              <w:right w:val="single" w:color="C9C9C9" w:sz="4"/>
+            </w:tcBorders>
+            <w:tcMar>
+              <w:top w:type="dxa" w:w="50"/>
+              <w:left w:type="dxa" w:w="90"/>
+              <w:bottom w:type="dxa" w:w="50"/>
+              <w:right w:type="dxa" w:w="90"/>
+            </w:tcMar>
+          </w:tcPr>
+          <w:p>
+            <w:r>
+              <w:rPr>
+                <w:rFonts w:ascii="Arial" w:cs="Arial" w:eastAsia="Arial" w:hAnsi="Arial"/>
+                <w:b/>
+                <w:bCs/>
+                <w:sz w:val="17"/>
+                <w:szCs w:val="17"/>
+              </w:rPr>
+              <w:t xml:space="preserve">Proyecto de Claude</w:t>
+            </w:r>
+            <w:r>
+              <w:rPr>
+                <w:rFonts w:ascii="Arial" w:cs="Arial" w:eastAsia="Arial" w:hAnsi="Arial"/>
+                <w:b w:val="false"/>
+                <w:bCs w:val="false"/>
+                <w:sz w:val="17"/>
+                <w:szCs w:val="17"/>
+              </w:rPr>
+              <w:t xml:space="preserve"> con la guía, el diagnóstico, las decisiones y las evidencias</w:t>
+            </w:r>
+          </w:p>
+        </w:tc>
+        <w:tc>
+          <w:tcPr>
+            <w:tcW w:type="dxa" w:w="5738"/>
+            <w:tcBorders>
+              <w:top w:val="single" w:color="C9C9C9" w:sz="4"/>
+              <w:left w:val="single" w:color="C9C9C9" w:sz="4"/>
+              <w:bottom w:val="single" w:color="C9C9C9" w:sz="4"/>
+              <w:right w:val="single" w:color="C9C9C9" w:sz="4"/>
+            </w:tcBorders>
+            <w:tcMar>
+              <w:top w:type="dxa" w:w="50"/>
+              <w:left w:type="dxa" w:w="90"/>
+              <w:bottom w:type="dxa" w:w="50"/>
+              <w:right w:type="dxa" w:w="90"/>
+            </w:tcMar>
+          </w:tcPr>
+          <w:p>
+            <w:r>
+              <w:rPr>
+                <w:rFonts w:ascii="Arial" w:cs="Arial" w:eastAsia="Arial" w:hAnsi="Arial"/>
+                <w:b w:val="false"/>
+                <w:bCs w:val="false"/>
+                <w:sz w:val="17"/>
+                <w:szCs w:val="17"/>
+              </w:rPr>
+              <w:t xml:space="preserve">Contexto persistente: cada sesión parte de los requisitos y de lo ya decidido</w:t>
+            </w:r>
+          </w:p>
+        </w:tc>
+      </w:tr>
+      <w:tr>
+        <w:tc>
+          <w:tcPr>
+            <w:tcW w:type="dxa" w:w="3900"/>
+            <w:tcBorders>
+              <w:top w:val="single" w:color="C9C9C9" w:sz="4"/>
+              <w:left w:val="single" w:color="C9C9C9" w:sz="4"/>
+              <w:bottom w:val="single" w:color="C9C9C9" w:sz="4"/>
+              <w:right w:val="single" w:color="C9C9C9" w:sz="4"/>
+            </w:tcBorders>
+            <w:tcMar>
+              <w:top w:type="dxa" w:w="50"/>
+              <w:left w:type="dxa" w:w="90"/>
+              <w:bottom w:type="dxa" w:w="50"/>
+              <w:right w:type="dxa" w:w="90"/>
+            </w:tcMar>
+          </w:tcPr>
+          <w:p>
+            <w:r>
+              <w:rPr>
+                <w:rFonts w:ascii="Arial" w:cs="Arial" w:eastAsia="Arial" w:hAnsi="Arial"/>
+                <w:b/>
+                <w:bCs/>
+                <w:sz w:val="17"/>
+                <w:szCs w:val="17"/>
+              </w:rPr>
+              <w:t xml:space="preserve">Conectores:</w:t>
+            </w:r>
+            <w:r>
+              <w:rPr>
+                <w:rFonts w:ascii="Arial" w:cs="Arial" w:eastAsia="Arial" w:hAnsi="Arial"/>
+                <w:b w:val="false"/>
+                <w:bCs w:val="false"/>
+                <w:sz w:val="17"/>
+                <w:szCs w:val="17"/>
+              </w:rPr>
+              <w:t xml:space="preserve"> GitHub, Google Drive, búsqueda web y navegador integrado</w:t>
+            </w:r>
+          </w:p>
+        </w:tc>
+        <w:tc>
+          <w:tcPr>
+            <w:tcW w:type="dxa" w:w="5738"/>
+            <w:tcBorders>
+              <w:top w:val="single" w:color="C9C9C9" w:sz="4"/>
+              <w:left w:val="single" w:color="C9C9C9" w:sz="4"/>
+              <w:bottom w:val="single" w:color="C9C9C9" w:sz="4"/>
+              <w:right w:val="single" w:color="C9C9C9" w:sz="4"/>
+            </w:tcBorders>
+            <w:tcMar>
+              <w:top w:type="dxa" w:w="50"/>
+              <w:left w:type="dxa" w:w="90"/>
+              <w:bottom w:type="dxa" w:w="50"/>
+              <w:right w:type="dxa" w:w="90"/>
+            </w:tcMar>
+          </w:tcPr>
+          <w:p>
+            <w:r>
+              <w:rPr>
+                <w:rFonts w:ascii="Arial" w:cs="Arial" w:eastAsia="Arial" w:hAnsi="Arial"/>
+                <w:b w:val="false"/>
+                <w:bCs w:val="false"/>
+                <w:sz w:val="17"/>
+                <w:szCs w:val="17"/>
+              </w:rPr>
+              <w:t xml:space="preserve">Repositorio, documentos de trabajo, verificación de fuentes públicas y revisión de la app (solo lectura)</w:t>
+            </w:r>
+          </w:p>
+        </w:tc>
+      </w:tr>
+      <w:tr>
+        <w:tc>
+          <w:tcPr>
+            <w:tcW w:type="dxa" w:w="3900"/>
+            <w:tcBorders>
+              <w:top w:val="single" w:color="C9C9C9" w:sz="4"/>
+              <w:left w:val="single" w:color="C9C9C9" w:sz="4"/>
+              <w:bottom w:val="single" w:color="C9C9C9" w:sz="4"/>
+              <w:right w:val="single" w:color="C9C9C9" w:sz="4"/>
+            </w:tcBorders>
+            <w:tcMar>
+              <w:top w:type="dxa" w:w="50"/>
+              <w:left w:type="dxa" w:w="90"/>
+              <w:bottom w:type="dxa" w:w="50"/>
+              <w:right w:type="dxa" w:w="90"/>
+            </w:tcMar>
+          </w:tcPr>
+          <w:p>
+            <w:r>
+              <w:rPr>
+                <w:rFonts w:ascii="Arial" w:cs="Arial" w:eastAsia="Arial" w:hAnsi="Arial"/>
+                <w:b/>
+                <w:bCs/>
+                <w:sz w:val="17"/>
+                <w:szCs w:val="17"/>
+              </w:rPr>
+              <w:t xml:space="preserve">Skills de la plataforma:</w:t>
+            </w:r>
+            <w:r>
+              <w:rPr>
+                <w:rFonts w:ascii="Arial" w:cs="Arial" w:eastAsia="Arial" w:hAnsi="Arial"/>
+                <w:b w:val="false"/>
+                <w:bCs w:val="false"/>
+                <w:sz w:val="17"/>
+                <w:szCs w:val="17"/>
+              </w:rPr>
+              <w:t xml:space="preserve"> docx y navegador integrado</w:t>
+            </w:r>
+          </w:p>
+        </w:tc>
+        <w:tc>
+          <w:tcPr>
+            <w:tcW w:type="dxa" w:w="5738"/>
+            <w:tcBorders>
+              <w:top w:val="single" w:color="C9C9C9" w:sz="4"/>
+              <w:left w:val="single" w:color="C9C9C9" w:sz="4"/>
+              <w:bottom w:val="single" w:color="C9C9C9" w:sz="4"/>
+              <w:right w:val="single" w:color="C9C9C9" w:sz="4"/>
+            </w:tcBorders>
+            <w:tcMar>
+              <w:top w:type="dxa" w:w="50"/>
+              <w:left w:type="dxa" w:w="90"/>
+              <w:bottom w:type="dxa" w:w="50"/>
+              <w:right w:type="dxa" w:w="90"/>
+            </w:tcMar>
+          </w:tcPr>
+          <w:p>
+            <w:r>
+              <w:rPr>
+                <w:rFonts w:ascii="Arial" w:cs="Arial" w:eastAsia="Arial" w:hAnsi="Arial"/>
+                <w:b w:val="false"/>
+                <w:bCs w:val="false"/>
+                <w:sz w:val="17"/>
+                <w:szCs w:val="17"/>
+              </w:rPr>
+              <w:t xml:space="preserve">Instrucciones empaquetadas para generar esta memoria en Word y para usar el navegador con sus límites</w:t>
+            </w:r>
+          </w:p>
+        </w:tc>
+      </w:tr>
+      <w:tr>
+        <w:tc>
+          <w:tcPr>
+            <w:tcW w:type="dxa" w:w="3900"/>
+            <w:tcBorders>
+              <w:top w:val="single" w:color="C9C9C9" w:sz="4"/>
+              <w:left w:val="single" w:color="C9C9C9" w:sz="4"/>
+              <w:bottom w:val="single" w:color="C9C9C9" w:sz="4"/>
+              <w:right w:val="single" w:color="C9C9C9" w:sz="4"/>
+            </w:tcBorders>
+            <w:tcMar>
+              <w:top w:type="dxa" w:w="50"/>
+              <w:left w:type="dxa" w:w="90"/>
+              <w:bottom w:type="dxa" w:w="50"/>
+              <w:right w:type="dxa" w:w="90"/>
+            </w:tcMar>
+          </w:tcPr>
+          <w:p>
+            <w:r>
+              <w:rPr>
+                <w:rFonts w:ascii="Arial" w:cs="Arial" w:eastAsia="Arial" w:hAnsi="Arial"/>
+                <w:b/>
+                <w:bCs/>
+                <w:sz w:val="17"/>
+                <w:szCs w:val="17"/>
+              </w:rPr>
+              <w:t xml:space="preserve">CLAUDE.md</w:t>
+            </w:r>
+            <w:r>
+              <w:rPr>
+                <w:rFonts w:ascii="Arial" w:cs="Arial" w:eastAsia="Arial" w:hAnsi="Arial"/>
+                <w:b w:val="false"/>
+                <w:bCs w:val="false"/>
+                <w:sz w:val="17"/>
+                <w:szCs w:val="17"/>
+              </w:rPr>
+              <w:t xml:space="preserve"> del repositorio</w:t>
+            </w:r>
+          </w:p>
+        </w:tc>
+        <w:tc>
+          <w:tcPr>
+            <w:tcW w:type="dxa" w:w="5738"/>
+            <w:tcBorders>
+              <w:top w:val="single" w:color="C9C9C9" w:sz="4"/>
+              <w:left w:val="single" w:color="C9C9C9" w:sz="4"/>
+              <w:bottom w:val="single" w:color="C9C9C9" w:sz="4"/>
+              <w:right w:val="single" w:color="C9C9C9" w:sz="4"/>
+            </w:tcBorders>
+            <w:tcMar>
+              <w:top w:type="dxa" w:w="50"/>
+              <w:left w:type="dxa" w:w="90"/>
+              <w:bottom w:type="dxa" w:w="50"/>
+              <w:right w:type="dxa" w:w="90"/>
+            </w:tcMar>
+          </w:tcPr>
+          <w:p>
+            <w:r>
+              <w:rPr>
+                <w:rFonts w:ascii="Arial" w:cs="Arial" w:eastAsia="Arial" w:hAnsi="Arial"/>
+                <w:b w:val="false"/>
+                <w:bCs w:val="false"/>
+                <w:sz w:val="17"/>
+                <w:szCs w:val="17"/>
+              </w:rPr>
+              <w:t xml:space="preserve">Las reglas que la IA cumple siempre: sin datos sintéticos ni respaldos silenciosos, trazabilidad por fila, nada se descarta sin rastro, pruebas antes de cada commit, sin secretos y registro de cada cambio con IA</w:t>
+            </w:r>
+          </w:p>
+        </w:tc>
+      </w:tr>
+    </w:tbl>
+    <w:p>
+      <w:pPr>
+        <w:spacing w:after="100" w:line="276"/>
+        <w:jc w:val="both"/>
+      </w:pPr>
+    </w:p>
+    <w:p>
+      <w:pPr>
+        <w:spacing w:after="100" w:line="276"/>
+        <w:jc w:val="both"/>
+      </w:pPr>
+      <w:r>
+        <w:rPr>
+          <w:rFonts w:ascii="Arial" w:cs="Arial" w:eastAsia="Arial" w:hAnsi="Arial"/>
+          <w:sz w:val="20"/>
+          <w:szCs w:val="20"/>
+        </w:rPr>
+        <w:t xml:space="preserve">Las tres primeras reglas de CLAUDE.md traducen los hallazgos del diagnóstico: son justo los errores que el pipeline heredado cometía y que una IA podría reintroducir sin darse cuenta. Los encargos siguieron las cinco piezas de la guía (§8): una tarea concreta cada vez, el contexto del proyecto, los límites de CLAUDE.md, un formato de salida definido y una verificación asociada. Los prompts clave se guardan literales en docs/uso_ia.md.</w:t>
+      </w:r>
+    </w:p>
+    <w:p>
+      <w:pPr>
+        <w:pStyle w:val="Heading2"/>
+        <w:keepNext/>
+        <w:keepLines/>
+        <w:spacing w:after="80" w:before="160"/>
+      </w:pPr>
+      <w:r>
+        <w:rPr>
+          <w:rFonts w:ascii="Arial" w:cs="Arial" w:eastAsia="Arial" w:hAnsi="Arial"/>
+          <w:b/>
+          <w:bCs/>
+          <w:color w:val="333333"/>
+          <w:sz w:val="22"/>
+          <w:szCs w:val="22"/>
+        </w:rPr>
+        <w:t xml:space="preserve">Límites y verificación</w:t>
+      </w:r>
+    </w:p>
+    <w:p>
+      <w:pPr>
+        <w:pStyle w:val="ListParagraph"/>
+        <w:numPr>
+          <w:ilvl w:val="0"/>
+          <w:numId w:val="2"/>
+        </w:numPr>
+        <w:spacing w:after="50" w:line="264"/>
+      </w:pPr>
+      <w:r>
+        <w:rPr>
+          <w:rFonts w:ascii="Arial" w:cs="Arial" w:eastAsia="Arial" w:hAnsi="Arial"/>
+          <w:b/>
+          <w:bCs/>
+          <w:sz w:val="20"/>
+          <w:szCs w:val="20"/>
+        </w:rPr>
+        <w:t xml:space="preserve">La IA no ejecuta en Databricks ni maneja credenciales:</w:t>
+      </w:r>
+      <w:r>
+        <w:rPr>
+          <w:rFonts w:ascii="Arial" w:cs="Arial" w:eastAsia="Arial" w:hAnsi="Arial"/>
+          <w:sz w:val="20"/>
+          <w:szCs w:val="20"/>
+        </w:rPr>
+        <w:t xml:space="preserve"> la autora ejecuta cada celda, crea el Job, la app y los permisos, y aporta la captura. Se dejó de automatizar la consola desde el navegador al aparecer el aviso de control automatizado.</w:t>
+      </w:r>
+    </w:p>
+    <w:p>
+      <w:pPr>
+        <w:pStyle w:val="ListParagraph"/>
+        <w:numPr>
+          <w:ilvl w:val="0"/>
+          <w:numId w:val="2"/>
+        </w:numPr>
+        <w:spacing w:after="50" w:line="264"/>
+      </w:pPr>
+      <w:r>
+        <w:rPr>
+          <w:rFonts w:ascii="Arial" w:cs="Arial" w:eastAsia="Arial" w:hAnsi="Arial"/>
+          <w:b/>
+          <w:bCs/>
+          <w:sz w:val="20"/>
+          <w:szCs w:val="20"/>
+        </w:rPr>
+        <w:t xml:space="preserve">Cada salida tiene su comprobación:</w:t>
+      </w:r>
+      <w:r>
+        <w:rPr>
+          <w:rFonts w:ascii="Arial" w:cs="Arial" w:eastAsia="Arial" w:hAnsi="Arial"/>
+          <w:sz w:val="20"/>
+          <w:szCs w:val="20"/>
+        </w:rPr>
+        <w:t xml:space="preserve"> pruebas unitarias, ejecución real con captura fechada, los 14 controles de calidad, contraste con fuente oficial (DOCa, AEMET) y, para los comentarios de los notebooks, comparación del árbol sintáctico para asegurar que el código no cambió.</w:t>
+      </w:r>
+    </w:p>
+    <w:p>
+      <w:pPr>
+        <w:pStyle w:val="Heading2"/>
+        <w:keepNext/>
+        <w:keepLines/>
+        <w:spacing w:after="80" w:before="160"/>
+      </w:pPr>
+      <w:r>
+        <w:rPr>
+          <w:rFonts w:ascii="Arial" w:cs="Arial" w:eastAsia="Arial" w:hAnsi="Arial"/>
+          <w:b/>
+          <w:bCs/>
+          <w:color w:val="333333"/>
+          <w:sz w:val="22"/>
+          <w:szCs w:val="22"/>
+        </w:rPr>
+        <w:t xml:space="preserve">Dónde se equivocó la IA</w:t>
+      </w:r>
+    </w:p>
+    <w:tbl>
+      <w:tblPr>
+        <w:tblW w:type="dxa" w:w="9638"/>
+        <w:tblBorders>
+          <w:top w:val="single" w:color="auto" w:sz="4"/>
+          <w:left w:val="single" w:color="auto" w:sz="4"/>
+          <w:bottom w:val="single" w:color="auto" w:sz="4"/>
+          <w:right w:val="single" w:color="auto" w:sz="4"/>
+          <w:insideH w:val="single" w:color="auto" w:sz="4"/>
+          <w:insideV w:val="single" w:color="auto" w:sz="4"/>
+        </w:tblBorders>
+      </w:tblPr>
+      <w:tblGrid>
+        <w:gridCol w:w="2900"/>
+        <w:gridCol w:w="3300"/>
+        <w:gridCol w:w="3438"/>
+      </w:tblGrid>
+      <w:tr>
+        <w:trPr>
+          <w:tblHeader/>
+        </w:trPr>
+        <w:tc>
+          <w:tcPr>
+            <w:tcW w:type="dxa" w:w="2900"/>
+            <w:tcBorders>
+              <w:top w:val="single" w:color="C9C9C9" w:sz="4"/>
+              <w:left w:val="single" w:color="C9C9C9" w:sz="4"/>
+              <w:bottom w:val="single" w:color="C9C9C9" w:sz="4"/>
+              <w:right w:val="single" w:color="C9C9C9" w:sz="4"/>
+            </w:tcBorders>
+            <w:shd w:fill="EBDDE2" w:val="clear"/>
+            <w:tcMar>
+              <w:top w:type="dxa" w:w="50"/>
+              <w:left w:type="dxa" w:w="90"/>
+              <w:bottom w:type="dxa" w:w="50"/>
+              <w:right w:type="dxa" w:w="90"/>
+            </w:tcMar>
+          </w:tcPr>
+          <w:p>
+            <w:r>
+              <w:rPr>
+                <w:rFonts w:ascii="Arial" w:cs="Arial" w:eastAsia="Arial" w:hAnsi="Arial"/>
+                <w:b/>
+                <w:bCs/>
+                <w:sz w:val="17"/>
+                <w:szCs w:val="17"/>
+              </w:rPr>
+              <w:t xml:space="preserve">Caso</w:t>
+            </w:r>
+          </w:p>
+        </w:tc>
+        <w:tc>
+          <w:tcPr>
+            <w:tcW w:type="dxa" w:w="3300"/>
+            <w:tcBorders>
+              <w:top w:val="single" w:color="C9C9C9" w:sz="4"/>
+              <w:left w:val="single" w:color="C9C9C9" w:sz="4"/>
+              <w:bottom w:val="single" w:color="C9C9C9" w:sz="4"/>
+              <w:right w:val="single" w:color="C9C9C9" w:sz="4"/>
+            </w:tcBorders>
+            <w:shd w:fill="EBDDE2" w:val="clear"/>
+            <w:tcMar>
+              <w:top w:type="dxa" w:w="50"/>
+              <w:left w:type="dxa" w:w="90"/>
+              <w:bottom w:type="dxa" w:w="50"/>
+              <w:right w:type="dxa" w:w="90"/>
+            </w:tcMar>
+          </w:tcPr>
+          <w:p>
+            <w:r>
+              <w:rPr>
+                <w:rFonts w:ascii="Arial" w:cs="Arial" w:eastAsia="Arial" w:hAnsi="Arial"/>
+                <w:b/>
+                <w:bCs/>
+                <w:sz w:val="17"/>
+                <w:szCs w:val="17"/>
+              </w:rPr>
+              <w:t xml:space="preserve">Qué pasó</w:t>
+            </w:r>
+          </w:p>
+        </w:tc>
+        <w:tc>
+          <w:tcPr>
+            <w:tcW w:type="dxa" w:w="3438"/>
+            <w:tcBorders>
+              <w:top w:val="single" w:color="C9C9C9" w:sz="4"/>
+              <w:left w:val="single" w:color="C9C9C9" w:sz="4"/>
+              <w:bottom w:val="single" w:color="C9C9C9" w:sz="4"/>
+              <w:right w:val="single" w:color="C9C9C9" w:sz="4"/>
+            </w:tcBorders>
+            <w:shd w:fill="EBDDE2" w:val="clear"/>
+            <w:tcMar>
+              <w:top w:type="dxa" w:w="50"/>
+              <w:left w:type="dxa" w:w="90"/>
+              <w:bottom w:type="dxa" w:w="50"/>
+              <w:right w:type="dxa" w:w="90"/>
+            </w:tcMar>
+          </w:tcPr>
+          <w:p>
+            <w:r>
+              <w:rPr>
+                <w:rFonts w:ascii="Arial" w:cs="Arial" w:eastAsia="Arial" w:hAnsi="Arial"/>
+                <w:b/>
+                <w:bCs/>
+                <w:sz w:val="17"/>
+                <w:szCs w:val="17"/>
+              </w:rPr>
+              <w:t xml:space="preserve">Cómo se detectó</w:t>
+            </w:r>
+          </w:p>
+        </w:tc>
+      </w:tr>
+      <w:tr>
+        <w:tc>
+          <w:tcPr>
+            <w:tcW w:type="dxa" w:w="2900"/>
+            <w:tcBorders>
+              <w:top w:val="single" w:color="C9C9C9" w:sz="4"/>
+              <w:left w:val="single" w:color="C9C9C9" w:sz="4"/>
+              <w:bottom w:val="single" w:color="C9C9C9" w:sz="4"/>
+              <w:right w:val="single" w:color="C9C9C9" w:sz="4"/>
+            </w:tcBorders>
+            <w:tcMar>
+              <w:top w:type="dxa" w:w="50"/>
+              <w:left w:type="dxa" w:w="90"/>
+              <w:bottom w:type="dxa" w:w="50"/>
+              <w:right w:type="dxa" w:w="90"/>
+            </w:tcMar>
+          </w:tcPr>
+          <w:p>
+            <w:r>
+              <w:rPr>
+                <w:rFonts w:ascii="Arial" w:cs="Arial" w:eastAsia="Arial" w:hAnsi="Arial"/>
+                <w:b w:val="false"/>
+                <w:bCs w:val="false"/>
+                <w:sz w:val="17"/>
+                <w:szCs w:val="17"/>
+              </w:rPr>
+              <w:t xml:space="preserve">Permisos de la app (INC-06)</w:t>
+            </w:r>
+          </w:p>
+        </w:tc>
+        <w:tc>
+          <w:tcPr>
+            <w:tcW w:type="dxa" w:w="3300"/>
+            <w:tcBorders>
+              <w:top w:val="single" w:color="C9C9C9" w:sz="4"/>
+              <w:left w:val="single" w:color="C9C9C9" w:sz="4"/>
+              <w:bottom w:val="single" w:color="C9C9C9" w:sz="4"/>
+              <w:right w:val="single" w:color="C9C9C9" w:sz="4"/>
+            </w:tcBorders>
+            <w:tcMar>
+              <w:top w:type="dxa" w:w="50"/>
+              <w:left w:type="dxa" w:w="90"/>
+              <w:bottom w:type="dxa" w:w="50"/>
+              <w:right w:type="dxa" w:w="90"/>
+            </w:tcMar>
+          </w:tcPr>
+          <w:p>
+            <w:r>
+              <w:rPr>
+                <w:rFonts w:ascii="Arial" w:cs="Arial" w:eastAsia="Arial" w:hAnsi="Arial"/>
+                <w:b w:val="false"/>
+                <w:bCs w:val="false"/>
+                <w:sz w:val="17"/>
+                <w:szCs w:val="17"/>
+              </w:rPr>
+              <w:t xml:space="preserve">El GRANT propuesto se ejecutó sin error, pero sin efecto</w:t>
+            </w:r>
+          </w:p>
+        </w:tc>
+        <w:tc>
+          <w:tcPr>
+            <w:tcW w:type="dxa" w:w="3438"/>
+            <w:tcBorders>
+              <w:top w:val="single" w:color="C9C9C9" w:sz="4"/>
+              <w:left w:val="single" w:color="C9C9C9" w:sz="4"/>
+              <w:bottom w:val="single" w:color="C9C9C9" w:sz="4"/>
+              <w:right w:val="single" w:color="C9C9C9" w:sz="4"/>
+            </w:tcBorders>
+            <w:tcMar>
+              <w:top w:type="dxa" w:w="50"/>
+              <w:left w:type="dxa" w:w="90"/>
+              <w:bottom w:type="dxa" w:w="50"/>
+              <w:right w:type="dxa" w:w="90"/>
+            </w:tcMar>
+          </w:tcPr>
+          <w:p>
+            <w:r>
+              <w:rPr>
+                <w:rFonts w:ascii="Arial" w:cs="Arial" w:eastAsia="Arial" w:hAnsi="Arial"/>
+                <w:b w:val="false"/>
+                <w:bCs w:val="false"/>
+                <w:sz w:val="17"/>
+                <w:szCs w:val="17"/>
+              </w:rPr>
+              <w:t xml:space="preserve">SHOW GRANTS vacío; corregido desde Catalog Explorer</w:t>
+            </w:r>
+          </w:p>
+        </w:tc>
+      </w:tr>
+      <w:tr>
+        <w:tc>
+          <w:tcPr>
+            <w:tcW w:type="dxa" w:w="2900"/>
+            <w:tcBorders>
+              <w:top w:val="single" w:color="C9C9C9" w:sz="4"/>
+              <w:left w:val="single" w:color="C9C9C9" w:sz="4"/>
+              <w:bottom w:val="single" w:color="C9C9C9" w:sz="4"/>
+              <w:right w:val="single" w:color="C9C9C9" w:sz="4"/>
+            </w:tcBorders>
+            <w:tcMar>
+              <w:top w:type="dxa" w:w="50"/>
+              <w:left w:type="dxa" w:w="90"/>
+              <w:bottom w:type="dxa" w:w="50"/>
+              <w:right w:type="dxa" w:w="90"/>
+            </w:tcMar>
+          </w:tcPr>
+          <w:p>
+            <w:r>
+              <w:rPr>
+                <w:rFonts w:ascii="Arial" w:cs="Arial" w:eastAsia="Arial" w:hAnsi="Arial"/>
+                <w:b w:val="false"/>
+                <w:bCs w:val="false"/>
+                <w:sz w:val="17"/>
+                <w:szCs w:val="17"/>
+              </w:rPr>
+              <w:t xml:space="preserve">Límite de 8 MiB (INC-02) y reinicio tras %pip (INC-03)</w:t>
+            </w:r>
+          </w:p>
+        </w:tc>
+        <w:tc>
+          <w:tcPr>
+            <w:tcW w:type="dxa" w:w="3300"/>
+            <w:tcBorders>
+              <w:top w:val="single" w:color="C9C9C9" w:sz="4"/>
+              <w:left w:val="single" w:color="C9C9C9" w:sz="4"/>
+              <w:bottom w:val="single" w:color="C9C9C9" w:sz="4"/>
+              <w:right w:val="single" w:color="C9C9C9" w:sz="4"/>
+            </w:tcBorders>
+            <w:tcMar>
+              <w:top w:type="dxa" w:w="50"/>
+              <w:left w:type="dxa" w:w="90"/>
+              <w:bottom w:type="dxa" w:w="50"/>
+              <w:right w:type="dxa" w:w="90"/>
+            </w:tcMar>
+          </w:tcPr>
+          <w:p>
+            <w:r>
+              <w:rPr>
+                <w:rFonts w:ascii="Arial" w:cs="Arial" w:eastAsia="Arial" w:hAnsi="Arial"/>
+                <w:b w:val="false"/>
+                <w:bCs w:val="false"/>
+                <w:sz w:val="17"/>
+                <w:szCs w:val="17"/>
+              </w:rPr>
+              <w:t xml:space="preserve">Límites de la plataforma no anticipados</w:t>
+            </w:r>
+          </w:p>
+        </w:tc>
+        <w:tc>
+          <w:tcPr>
+            <w:tcW w:type="dxa" w:w="3438"/>
+            <w:tcBorders>
+              <w:top w:val="single" w:color="C9C9C9" w:sz="4"/>
+              <w:left w:val="single" w:color="C9C9C9" w:sz="4"/>
+              <w:bottom w:val="single" w:color="C9C9C9" w:sz="4"/>
+              <w:right w:val="single" w:color="C9C9C9" w:sz="4"/>
+            </w:tcBorders>
+            <w:tcMar>
+              <w:top w:type="dxa" w:w="50"/>
+              <w:left w:type="dxa" w:w="90"/>
+              <w:bottom w:type="dxa" w:w="50"/>
+              <w:right w:type="dxa" w:w="90"/>
+            </w:tcMar>
+          </w:tcPr>
+          <w:p>
+            <w:r>
+              <w:rPr>
+                <w:rFonts w:ascii="Arial" w:cs="Arial" w:eastAsia="Arial" w:hAnsi="Arial"/>
+                <w:b w:val="false"/>
+                <w:bCs w:val="false"/>
+                <w:sz w:val="17"/>
+                <w:szCs w:val="17"/>
+              </w:rPr>
+              <w:t xml:space="preserve">Errores en la primera ejecución real</w:t>
+            </w:r>
+          </w:p>
+        </w:tc>
+      </w:tr>
+      <w:tr>
+        <w:tc>
+          <w:tcPr>
+            <w:tcW w:type="dxa" w:w="2900"/>
+            <w:tcBorders>
+              <w:top w:val="single" w:color="C9C9C9" w:sz="4"/>
+              <w:left w:val="single" w:color="C9C9C9" w:sz="4"/>
+              <w:bottom w:val="single" w:color="C9C9C9" w:sz="4"/>
+              <w:right w:val="single" w:color="C9C9C9" w:sz="4"/>
+            </w:tcBorders>
+            <w:tcMar>
+              <w:top w:type="dxa" w:w="50"/>
+              <w:left w:type="dxa" w:w="90"/>
+              <w:bottom w:type="dxa" w:w="50"/>
+              <w:right w:type="dxa" w:w="90"/>
+            </w:tcMar>
+          </w:tcPr>
+          <w:p>
+            <w:r>
+              <w:rPr>
+                <w:rFonts w:ascii="Arial" w:cs="Arial" w:eastAsia="Arial" w:hAnsi="Arial"/>
+                <w:b w:val="false"/>
+                <w:bCs w:val="false"/>
+                <w:sz w:val="17"/>
+                <w:szCs w:val="17"/>
+              </w:rPr>
+              <w:t xml:space="preserve">Repositorio privado (INC-05)</w:t>
+            </w:r>
+          </w:p>
+        </w:tc>
+        <w:tc>
+          <w:tcPr>
+            <w:tcW w:type="dxa" w:w="3300"/>
+            <w:tcBorders>
+              <w:top w:val="single" w:color="C9C9C9" w:sz="4"/>
+              <w:left w:val="single" w:color="C9C9C9" w:sz="4"/>
+              <w:bottom w:val="single" w:color="C9C9C9" w:sz="4"/>
+              <w:right w:val="single" w:color="C9C9C9" w:sz="4"/>
+            </w:tcBorders>
+            <w:tcMar>
+              <w:top w:type="dxa" w:w="50"/>
+              <w:left w:type="dxa" w:w="90"/>
+              <w:bottom w:type="dxa" w:w="50"/>
+              <w:right w:type="dxa" w:w="90"/>
+            </w:tcMar>
+          </w:tcPr>
+          <w:p>
+            <w:r>
+              <w:rPr>
+                <w:rFonts w:ascii="Arial" w:cs="Arial" w:eastAsia="Arial" w:hAnsi="Arial"/>
+                <w:b w:val="false"/>
+                <w:bCs w:val="false"/>
+                <w:sz w:val="17"/>
+                <w:szCs w:val="17"/>
+              </w:rPr>
+              <w:t xml:space="preserve">Se asumió que la app podría leerlo</w:t>
+            </w:r>
+          </w:p>
+        </w:tc>
+        <w:tc>
+          <w:tcPr>
+            <w:tcW w:type="dxa" w:w="3438"/>
+            <w:tcBorders>
+              <w:top w:val="single" w:color="C9C9C9" w:sz="4"/>
+              <w:left w:val="single" w:color="C9C9C9" w:sz="4"/>
+              <w:bottom w:val="single" w:color="C9C9C9" w:sz="4"/>
+              <w:right w:val="single" w:color="C9C9C9" w:sz="4"/>
+            </w:tcBorders>
+            <w:tcMar>
+              <w:top w:type="dxa" w:w="50"/>
+              <w:left w:type="dxa" w:w="90"/>
+              <w:bottom w:type="dxa" w:w="50"/>
+              <w:right w:type="dxa" w:w="90"/>
+            </w:tcMar>
+          </w:tcPr>
+          <w:p>
+            <w:r>
+              <w:rPr>
+                <w:rFonts w:ascii="Arial" w:cs="Arial" w:eastAsia="Arial" w:hAnsi="Arial"/>
+                <w:b w:val="false"/>
+                <w:bCs w:val="false"/>
+                <w:sz w:val="17"/>
+                <w:szCs w:val="17"/>
+              </w:rPr>
+              <w:t xml:space="preserve">Error «no credential» al desplegar</w:t>
+            </w:r>
+          </w:p>
+        </w:tc>
+      </w:tr>
+      <w:tr>
+        <w:tc>
+          <w:tcPr>
+            <w:tcW w:type="dxa" w:w="2900"/>
+            <w:tcBorders>
+              <w:top w:val="single" w:color="C9C9C9" w:sz="4"/>
+              <w:left w:val="single" w:color="C9C9C9" w:sz="4"/>
+              <w:bottom w:val="single" w:color="C9C9C9" w:sz="4"/>
+              <w:right w:val="single" w:color="C9C9C9" w:sz="4"/>
+            </w:tcBorders>
+            <w:tcMar>
+              <w:top w:type="dxa" w:w="50"/>
+              <w:left w:type="dxa" w:w="90"/>
+              <w:bottom w:type="dxa" w:w="50"/>
+              <w:right w:type="dxa" w:w="90"/>
+            </w:tcMar>
+          </w:tcPr>
+          <w:p>
+            <w:r>
+              <w:rPr>
+                <w:rFonts w:ascii="Arial" w:cs="Arial" w:eastAsia="Arial" w:hAnsi="Arial"/>
+                <w:b w:val="false"/>
+                <w:bCs w:val="false"/>
+                <w:sz w:val="17"/>
+                <w:szCs w:val="17"/>
+              </w:rPr>
+              <w:t xml:space="preserve">Valores de Winkler</w:t>
+            </w:r>
+          </w:p>
+        </w:tc>
+        <w:tc>
+          <w:tcPr>
+            <w:tcW w:type="dxa" w:w="3300"/>
+            <w:tcBorders>
+              <w:top w:val="single" w:color="C9C9C9" w:sz="4"/>
+              <w:left w:val="single" w:color="C9C9C9" w:sz="4"/>
+              <w:bottom w:val="single" w:color="C9C9C9" w:sz="4"/>
+              <w:right w:val="single" w:color="C9C9C9" w:sz="4"/>
+            </w:tcBorders>
+            <w:tcMar>
+              <w:top w:type="dxa" w:w="50"/>
+              <w:left w:type="dxa" w:w="90"/>
+              <w:bottom w:type="dxa" w:w="50"/>
+              <w:right w:type="dxa" w:w="90"/>
+            </w:tcMar>
+          </w:tcPr>
+          <w:p>
+            <w:r>
+              <w:rPr>
+                <w:rFonts w:ascii="Arial" w:cs="Arial" w:eastAsia="Arial" w:hAnsi="Arial"/>
+                <w:b w:val="false"/>
+                <w:bCs w:val="false"/>
+                <w:sz w:val="17"/>
+                <w:szCs w:val="17"/>
+              </w:rPr>
+              <w:t xml:space="preserve">Más altos que las referencias clásicas de Rioja</w:t>
+            </w:r>
+          </w:p>
+        </w:tc>
+        <w:tc>
+          <w:tcPr>
+            <w:tcW w:type="dxa" w:w="3438"/>
+            <w:tcBorders>
+              <w:top w:val="single" w:color="C9C9C9" w:sz="4"/>
+              <w:left w:val="single" w:color="C9C9C9" w:sz="4"/>
+              <w:bottom w:val="single" w:color="C9C9C9" w:sz="4"/>
+              <w:right w:val="single" w:color="C9C9C9" w:sz="4"/>
+            </w:tcBorders>
+            <w:tcMar>
+              <w:top w:type="dxa" w:w="50"/>
+              <w:left w:type="dxa" w:w="90"/>
+              <w:bottom w:type="dxa" w:w="50"/>
+              <w:right w:type="dxa" w:w="90"/>
+            </w:tcMar>
+          </w:tcPr>
+          <w:p>
+            <w:r>
+              <w:rPr>
+                <w:rFonts w:ascii="Arial" w:cs="Arial" w:eastAsia="Arial" w:hAnsi="Arial"/>
+                <w:b w:val="false"/>
+                <w:bCs w:val="false"/>
+                <w:sz w:val="17"/>
+                <w:szCs w:val="17"/>
+              </w:rPr>
+              <w:t xml:space="preserve">Contraste con un informe de AEMET antes de aceptarlos</w:t>
+            </w:r>
+          </w:p>
+        </w:tc>
+      </w:tr>
+    </w:tbl>
+    <w:p>
+      <w:pPr>
+        <w:spacing w:after="100" w:line="276"/>
+        <w:jc w:val="both"/>
+      </w:pPr>
+    </w:p>
+    <w:tbl>
+      <w:tblPr>
+        <w:tblW w:type="dxa" w:w="9638"/>
+        <w:tblBorders>
+          <w:top w:val="single" w:color="auto" w:sz="4"/>
+          <w:left w:val="single" w:color="auto" w:sz="4"/>
+          <w:bottom w:val="single" w:color="auto" w:sz="4"/>
+          <w:right w:val="single" w:color="auto" w:sz="4"/>
+          <w:insideH w:val="single" w:color="auto" w:sz="4"/>
+          <w:insideV w:val="single" w:color="auto" w:sz="4"/>
+        </w:tblBorders>
+      </w:tblPr>
+      <w:tblGrid>
+        <w:gridCol w:w="9638"/>
+      </w:tblGrid>
+      <w:tr>
+        <w:tc>
+          <w:tcPr>
+            <w:tcW w:type="dxa" w:w="9638"/>
+            <w:tcBorders>
+              <w:top w:val="single" w:color="C9C9C9" w:sz="4"/>
+              <w:left w:val="single" w:color="6B1D3A" w:sz="18"/>
+              <w:bottom w:val="single" w:color="C9C9C9" w:sz="4"/>
+              <w:right w:val="single" w:color="C9C9C9" w:sz="4"/>
+            </w:tcBorders>
+            <w:shd w:fill="F7F1F3" w:val="clear"/>
+            <w:tcMar>
+              <w:top w:type="dxa" w:w="80"/>
+              <w:left w:type="dxa" w:w="140"/>
+              <w:bottom w:type="dxa" w:w="80"/>
+              <w:right w:type="dxa" w:w="140"/>
+            </w:tcMar>
+          </w:tcPr>
+          <w:p>
+            <w:pPr>
+              <w:spacing w:after="40"/>
+            </w:pPr>
+            <w:r>
+              <w:rPr>
+                <w:rFonts w:ascii="Arial" w:cs="Arial" w:eastAsia="Arial" w:hAnsi="Arial"/>
+                <w:b/>
+                <w:bCs/>
+                <w:color w:val="6B1D3A"/>
+                <w:sz w:val="17"/>
+                <w:szCs w:val="17"/>
+              </w:rPr>
+              <w:t xml:space="preserve">Stack: </w:t>
+            </w:r>
+            <w:r>
+              <w:rPr>
+                <w:rFonts w:ascii="Arial" w:cs="Arial" w:eastAsia="Arial" w:hAnsi="Arial"/>
+                <w:sz w:val="17"/>
+                <w:szCs w:val="17"/>
+              </w:rPr>
+              <w:t xml:space="preserve">Claude Opus 5.5 en la app de Claude; proyecto de Claude; conectores de GitHub y Google Drive; búsqueda web; navegador integrado; skills docx y navegador.</w:t>
+            </w:r>
+          </w:p>
+          <w:p>
+            <w:pPr>
+              <w:spacing w:after="40"/>
+            </w:pPr>
+            <w:r>
+              <w:rPr>
+                <w:rFonts w:ascii="Arial" w:cs="Arial" w:eastAsia="Arial" w:hAnsi="Arial"/>
+                <w:b/>
+                <w:bCs/>
+                <w:color w:val="6B1D3A"/>
+                <w:sz w:val="17"/>
+                <w:szCs w:val="17"/>
+              </w:rPr>
+              <w:t xml:space="preserve">Rol de la IA: </w:t>
+            </w:r>
+            <w:r>
+              <w:rPr>
+                <w:rFonts w:ascii="Arial" w:cs="Arial" w:eastAsia="Arial" w:hAnsi="Arial"/>
+                <w:sz w:val="17"/>
+                <w:szCs w:val="17"/>
+              </w:rPr>
+              <w:t xml:space="preserve">planificar las fases, escribir código y documentación, verificar fuentes públicas y proponer soluciones a las incidencias.</w:t>
+            </w:r>
+          </w:p>
+          <w:p>
+            <w:pPr>
+              <w:spacing w:after="40"/>
+            </w:pPr>
+            <w:r>
+              <w:rPr>
+                <w:rFonts w:ascii="Arial" w:cs="Arial" w:eastAsia="Arial" w:hAnsi="Arial"/>
+                <w:b/>
+                <w:bCs/>
+                <w:color w:val="6B1D3A"/>
+                <w:sz w:val="17"/>
+                <w:szCs w:val="17"/>
+              </w:rPr>
+              <w:t xml:space="preserve">Decisión y verificación humana: </w:t>
+            </w:r>
+            <w:r>
+              <w:rPr>
+                <w:rFonts w:ascii="Arial" w:cs="Arial" w:eastAsia="Arial" w:hAnsi="Arial"/>
+                <w:sz w:val="17"/>
+                <w:szCs w:val="17"/>
+              </w:rPr>
+              <w:t xml:space="preserve">elegir el caso, el alcance y las fuentes; tomar las decisiones D-01 a D-18; ejecutar en la plataforma; detectar las incidencias y aceptar o rechazar cada salida con su evidencia.</w:t>
+            </w:r>
+          </w:p>
+        </w:tc>
+      </w:tr>
+    </w:tbl>
+    <w:p>
+      <w:pPr>
+        <w:spacing w:after="120"/>
+      </w:pPr>
+    </w:p>
+    <w:p>
+      <w:pPr>
+        <w:pStyle w:val="Heading1"/>
+        <w:keepNext/>
+        <w:keepLines/>
+        <w:spacing w:after="120" w:before="240"/>
+      </w:pPr>
+      <w:r>
+        <w:rPr>
+          <w:rFonts w:ascii="Arial" w:cs="Arial" w:eastAsia="Arial" w:hAnsi="Arial"/>
+          <w:b/>
+          <w:bCs/>
+          <w:color w:val="6B1D3A"/>
+          <w:sz w:val="28"/>
+          <w:szCs w:val="28"/>
+        </w:rPr>
+        <w:t xml:space="preserve">8. Justificación cuantitativa: horas y costes</w:t>
       </w:r>
     </w:p>
     <w:p>
@@ -9289,7 +10553,7 @@
           <w:sz w:val="28"/>
           <w:szCs w:val="28"/>
         </w:rPr>
-        <w:t xml:space="preserve">8. Conclusiones y límites</w:t>
+        <w:t xml:space="preserve">9. Conclusiones y límites</w:t>
       </w:r>
     </w:p>
     <w:p>
@@ -9362,7 +10626,7 @@
           <w:sz w:val="20"/>
           <w:szCs w:val="20"/>
         </w:rPr>
-        <w:t xml:space="preserve">Un uso de IA trazable: 4 entradas en el registro de IA, cada una con su verificación y con la decisión humana explícita.</w:t>
+        <w:t xml:space="preserve">Un uso de IA trazable y con reglas: un CLAUDE.md que fija lo que la IA no puede hacer, 7 entradas en el registro de IA con su verificación y la decisión humana explícita, y los casos en que la IA se equivocó, detectados y corregidos (sección 7).</w:t>
       </w:r>
     </w:p>
     <w:p>
@@ -9937,7 +11201,7 @@
                 <w:sz w:val="17"/>
                 <w:szCs w:val="17"/>
               </w:rPr>
-              <w:t xml:space="preserve">Registro de uso de IA (IA-001 a IA-004)</w:t>
+              <w:t xml:space="preserve">Registro de uso de IA (IA-001 a IA-007)</w:t>
             </w:r>
           </w:p>
         </w:tc>
@@ -9967,6 +11231,66 @@
                 <w:szCs w:val="17"/>
               </w:rPr>
               <w:t xml:space="preserve">docs/ai_log.md</w:t>
+            </w:r>
+          </w:p>
+        </w:tc>
+      </w:tr>
+      <w:tr>
+        <w:tc>
+          <w:tcPr>
+            <w:tcW w:type="dxa" w:w="4300"/>
+            <w:tcBorders>
+              <w:top w:val="single" w:color="C9C9C9" w:sz="4"/>
+              <w:left w:val="single" w:color="C9C9C9" w:sz="4"/>
+              <w:bottom w:val="single" w:color="C9C9C9" w:sz="4"/>
+              <w:right w:val="single" w:color="C9C9C9" w:sz="4"/>
+            </w:tcBorders>
+            <w:tcMar>
+              <w:top w:type="dxa" w:w="50"/>
+              <w:left w:type="dxa" w:w="90"/>
+              <w:bottom w:type="dxa" w:w="50"/>
+              <w:right w:type="dxa" w:w="90"/>
+            </w:tcMar>
+          </w:tcPr>
+          <w:p>
+            <w:r>
+              <w:rPr>
+                <w:rFonts w:ascii="Arial" w:cs="Arial" w:eastAsia="Arial" w:hAnsi="Arial"/>
+                <w:b w:val="false"/>
+                <w:bCs w:val="false"/>
+                <w:sz w:val="17"/>
+                <w:szCs w:val="17"/>
+              </w:rPr>
+              <w:t xml:space="preserve">Entorno de IA, skills, reglas y prompts clave</w:t>
+            </w:r>
+          </w:p>
+        </w:tc>
+        <w:tc>
+          <w:tcPr>
+            <w:tcW w:type="dxa" w:w="5338"/>
+            <w:tcBorders>
+              <w:top w:val="single" w:color="C9C9C9" w:sz="4"/>
+              <w:left w:val="single" w:color="C9C9C9" w:sz="4"/>
+              <w:bottom w:val="single" w:color="C9C9C9" w:sz="4"/>
+              <w:right w:val="single" w:color="C9C9C9" w:sz="4"/>
+            </w:tcBorders>
+            <w:tcMar>
+              <w:top w:type="dxa" w:w="50"/>
+              <w:left w:type="dxa" w:w="90"/>
+              <w:bottom w:type="dxa" w:w="50"/>
+              <w:right w:type="dxa" w:w="90"/>
+            </w:tcMar>
+          </w:tcPr>
+          <w:p>
+            <w:r>
+              <w:rPr>
+                <w:rFonts w:ascii="Arial" w:cs="Arial" w:eastAsia="Arial" w:hAnsi="Arial"/>
+                <w:b w:val="false"/>
+                <w:bCs w:val="false"/>
+                <w:sz w:val="17"/>
+                <w:szCs w:val="17"/>
+              </w:rPr>
+              <w:t xml:space="preserve">docs/uso_ia.md y CLAUDE.md</w:t>
             </w:r>
           </w:p>
         </w:tc>

</xml_diff>

<commit_message>
Skill reutilizable pipeline-datos-controlado, documentación y registro IA-008
Co-Authored-By: Claude Opus 5.5 <noreply@anthropic.com>
Claude-Session: https://claude.ai/code/session_01MGcbUB4LTJrt847y66pmRH
</commit_message>
<xml_diff>
--- a/docs/memoria/TFM_Agua_y_vinedo_La_Rioja.docx
+++ b/docs/memoria/TFM_Agua_y_vinedo_La_Rioja.docx
@@ -7831,7 +7831,7 @@
           <w:sz w:val="20"/>
           <w:szCs w:val="20"/>
         </w:rPr>
-        <w:t xml:space="preserve"> se trabajó; el detalle está en docs/uso_ia.md y en el registro de uso de IA (IA-001 a IA-007).</w:t>
+        <w:t xml:space="preserve"> se trabajó; el detalle está en docs/uso_ia.md y en el registro de uso de IA (IA-001 a IA-008).</w:t>
       </w:r>
     </w:p>
     <w:p>
@@ -8210,6 +8210,66 @@
                 <w:szCs w:val="17"/>
               </w:rPr>
               <w:t xml:space="preserve">Instrucciones empaquetadas para generar esta memoria en Word y para usar el navegador con sus límites</w:t>
+            </w:r>
+          </w:p>
+        </w:tc>
+      </w:tr>
+      <w:tr>
+        <w:tc>
+          <w:tcPr>
+            <w:tcW w:type="dxa" w:w="3900"/>
+            <w:tcBorders>
+              <w:top w:val="single" w:color="C9C9C9" w:sz="4"/>
+              <w:left w:val="single" w:color="C9C9C9" w:sz="4"/>
+              <w:bottom w:val="single" w:color="C9C9C9" w:sz="4"/>
+              <w:right w:val="single" w:color="C9C9C9" w:sz="4"/>
+            </w:tcBorders>
+            <w:tcMar>
+              <w:top w:type="dxa" w:w="50"/>
+              <w:left w:type="dxa" w:w="90"/>
+              <w:bottom w:type="dxa" w:w="50"/>
+              <w:right w:type="dxa" w:w="90"/>
+            </w:tcMar>
+          </w:tcPr>
+          <w:p>
+            <w:r>
+              <w:rPr>
+                <w:rFonts w:ascii="Arial" w:cs="Arial" w:eastAsia="Arial" w:hAnsi="Arial"/>
+                <w:b/>
+                <w:bCs/>
+                <w:sz w:val="17"/>
+                <w:szCs w:val="17"/>
+              </w:rPr>
+              <w:t xml:space="preserve">Skill propia: pipeline-datos-controlado</w:t>
+            </w:r>
+          </w:p>
+        </w:tc>
+        <w:tc>
+          <w:tcPr>
+            <w:tcW w:type="dxa" w:w="5738"/>
+            <w:tcBorders>
+              <w:top w:val="single" w:color="C9C9C9" w:sz="4"/>
+              <w:left w:val="single" w:color="C9C9C9" w:sz="4"/>
+              <w:bottom w:val="single" w:color="C9C9C9" w:sz="4"/>
+              <w:right w:val="single" w:color="C9C9C9" w:sz="4"/>
+            </w:tcBorders>
+            <w:tcMar>
+              <w:top w:type="dxa" w:w="50"/>
+              <w:left w:type="dxa" w:w="90"/>
+              <w:bottom w:type="dxa" w:w="50"/>
+              <w:right w:type="dxa" w:w="90"/>
+            </w:tcMar>
+          </w:tcPr>
+          <w:p>
+            <w:r>
+              <w:rPr>
+                <w:rFonts w:ascii="Arial" w:cs="Arial" w:eastAsia="Arial" w:hAnsi="Arial"/>
+                <w:b w:val="false"/>
+                <w:bCs w:val="false"/>
+                <w:sz w:val="17"/>
+                <w:szCs w:val="17"/>
+              </w:rPr>
+              <w:t xml:space="preserve">El método de este trabajo empaquetado para reutilizarlo: principios, fases, controles, notas de Databricks Free Edition y checklist (carpeta skills/ del repositorio)</w:t>
             </w:r>
           </w:p>
         </w:tc>
@@ -10626,7 +10686,7 @@
           <w:sz w:val="20"/>
           <w:szCs w:val="20"/>
         </w:rPr>
-        <w:t xml:space="preserve">Un uso de IA trazable y con reglas: un CLAUDE.md que fija lo que la IA no puede hacer, 7 entradas en el registro de IA con su verificación y la decisión humana explícita, y los casos en que la IA se equivocó, detectados y corregidos (sección 7).</w:t>
+        <w:t xml:space="preserve">Un uso de IA trazable y con reglas: un CLAUDE.md que fija lo que la IA no puede hacer, 8 entradas en el registro de IA con su verificación y la decisión humana explícita, y los casos en que la IA se equivocó, detectados y corregidos (sección 7).</w:t>
       </w:r>
     </w:p>
     <w:p>
@@ -11201,7 +11261,7 @@
                 <w:sz w:val="17"/>
                 <w:szCs w:val="17"/>
               </w:rPr>
-              <w:t xml:space="preserve">Registro de uso de IA (IA-001 a IA-007)</w:t>
+              <w:t xml:space="preserve">Registro de uso de IA (IA-001 a IA-008)</w:t>
             </w:r>
           </w:p>
         </w:tc>
@@ -11291,6 +11351,66 @@
                 <w:szCs w:val="17"/>
               </w:rPr>
               <w:t xml:space="preserve">docs/uso_ia.md y CLAUDE.md</w:t>
+            </w:r>
+          </w:p>
+        </w:tc>
+      </w:tr>
+      <w:tr>
+        <w:tc>
+          <w:tcPr>
+            <w:tcW w:type="dxa" w:w="4300"/>
+            <w:tcBorders>
+              <w:top w:val="single" w:color="C9C9C9" w:sz="4"/>
+              <w:left w:val="single" w:color="C9C9C9" w:sz="4"/>
+              <w:bottom w:val="single" w:color="C9C9C9" w:sz="4"/>
+              <w:right w:val="single" w:color="C9C9C9" w:sz="4"/>
+            </w:tcBorders>
+            <w:tcMar>
+              <w:top w:type="dxa" w:w="50"/>
+              <w:left w:type="dxa" w:w="90"/>
+              <w:bottom w:type="dxa" w:w="50"/>
+              <w:right w:type="dxa" w:w="90"/>
+            </w:tcMar>
+          </w:tcPr>
+          <w:p>
+            <w:r>
+              <w:rPr>
+                <w:rFonts w:ascii="Arial" w:cs="Arial" w:eastAsia="Arial" w:hAnsi="Arial"/>
+                <w:b w:val="false"/>
+                <w:bCs w:val="false"/>
+                <w:sz w:val="17"/>
+                <w:szCs w:val="17"/>
+              </w:rPr>
+              <w:t xml:space="preserve">Skill reutilizable del método</w:t>
+            </w:r>
+          </w:p>
+        </w:tc>
+        <w:tc>
+          <w:tcPr>
+            <w:tcW w:type="dxa" w:w="5338"/>
+            <w:tcBorders>
+              <w:top w:val="single" w:color="C9C9C9" w:sz="4"/>
+              <w:left w:val="single" w:color="C9C9C9" w:sz="4"/>
+              <w:bottom w:val="single" w:color="C9C9C9" w:sz="4"/>
+              <w:right w:val="single" w:color="C9C9C9" w:sz="4"/>
+            </w:tcBorders>
+            <w:tcMar>
+              <w:top w:type="dxa" w:w="50"/>
+              <w:left w:type="dxa" w:w="90"/>
+              <w:bottom w:type="dxa" w:w="50"/>
+              <w:right w:type="dxa" w:w="90"/>
+            </w:tcMar>
+          </w:tcPr>
+          <w:p>
+            <w:r>
+              <w:rPr>
+                <w:rFonts w:ascii="Arial" w:cs="Arial" w:eastAsia="Arial" w:hAnsi="Arial"/>
+                <w:b w:val="false"/>
+                <w:bCs w:val="false"/>
+                <w:sz w:val="17"/>
+                <w:szCs w:val="17"/>
+              </w:rPr>
+              <w:t xml:space="preserve">skills/pipeline-datos-controlado/SKILL.md</w:t>
             </w:r>
           </w:p>
         </w:tc>

</xml_diff>

<commit_message>
Evidencias E-28 y E-29 (salud del pipeline tras la ejecución programada) y tabla 5.3 de la memoria
Co-Authored-By: Claude Opus 5.5 <noreply@anthropic.com>
Claude-Session: https://claude.ai/code/session_01MGcbUB4LTJrt847y66pmRH
</commit_message>
<xml_diff>
--- a/docs/memoria/TFM_Agua_y_vinedo_La_Rioja.docx
+++ b/docs/memoria/TFM_Agua_y_vinedo_La_Rioja.docx
@@ -6581,7 +6581,7 @@
                 <w:sz w:val="17"/>
                 <w:szCs w:val="17"/>
               </w:rPr>
-              <w:t xml:space="preserve">Job programado</w:t>
+              <w:t xml:space="preserve">Job programado (primera desatendida)</w:t>
             </w:r>
           </w:p>
         </w:tc>
@@ -6610,7 +6610,7 @@
                 <w:sz w:val="17"/>
                 <w:szCs w:val="17"/>
               </w:rPr>
-              <w:t xml:space="preserve">[completar]</w:t>
+              <w:t xml:space="preserve">OK (último dato 21/10)</w:t>
             </w:r>
           </w:p>
         </w:tc>
@@ -6639,7 +6639,7 @@
                 <w:sz w:val="17"/>
                 <w:szCs w:val="17"/>
               </w:rPr>
-              <w:t xml:space="preserve">[completar]</w:t>
+              <w:t xml:space="preserve">Sin cambios</w:t>
             </w:r>
           </w:p>
         </w:tc>
@@ -6668,7 +6668,7 @@
                 <w:sz w:val="17"/>
                 <w:szCs w:val="17"/>
               </w:rPr>
-              <w:t xml:space="preserve">[completar]</w:t>
+              <w:t xml:space="preserve">14/14, 0 avisos</w:t>
             </w:r>
           </w:p>
         </w:tc>
@@ -6697,7 +6697,7 @@
                 <w:sz w:val="17"/>
                 <w:szCs w:val="17"/>
               </w:rPr>
-              <w:t xml:space="preserve">[completar]</w:t>
+              <w:t xml:space="preserve">OK (7 min 23 s)</w:t>
             </w:r>
           </w:p>
         </w:tc>

</xml_diff>

<commit_message>
Memoria: ROI con Claude Pro y horas actualizadas, voz de la autora; registro IA-009
Co-Authored-By: Claude Opus 5.5 <noreply@anthropic.com>
Claude-Session: https://claude.ai/code/session_01MGcbUB4LTJrt847y66pmRH
</commit_message>
<xml_diff>
--- a/docs/memoria/TFM_Agua_y_vinedo_La_Rioja.docx
+++ b/docs/memoria/TFM_Agua_y_vinedo_La_Rioja.docx
@@ -475,6 +475,30 @@
           <w:szCs w:val="20"/>
         </w:rPr>
         <w:t xml:space="preserve"> Para una bodega o un técnico de la DOCa Rioja, la pregunta de cada campaña es la misma: ¿cómo vienen el agua y el calor este año comparados con añadas anteriores? Los datos existen y son públicos (reserva de los embalses, lluvia y temperatura), pero están dispersos, en formatos poco amigables y sin control de calidad.</w:t>
+      </w:r>
+    </w:p>
+    <w:p>
+      <w:pPr>
+        <w:spacing w:after="100" w:line="276"/>
+        <w:jc w:val="both"/>
+      </w:pPr>
+      <w:r>
+        <w:rPr>
+          <w:rFonts w:ascii="Arial" w:cs="Arial" w:eastAsia="Arial" w:hAnsi="Arial"/>
+          <w:b/>
+          <w:bCs/>
+          <w:sz w:val="20"/>
+          <w:szCs w:val="20"/>
+        </w:rPr>
+        <w:t xml:space="preserve">Por qué este caso.</w:t>
+      </w:r>
+      <w:r>
+        <w:rPr>
+          <w:rFonts w:ascii="Arial" w:cs="Arial" w:eastAsia="Arial" w:hAnsi="Arial"/>
+          <w:sz w:val="20"/>
+          <w:szCs w:val="20"/>
+        </w:rPr>
+        <w:t xml:space="preserve"> Me gusta mucho el vino y me siento cercana a ese mundo: estudié hostelería y turismo. Además, me parecía un buen caso de uso para salir de mi foco habitual, el ecommerce, y comprobar que el mismo método de trabajo con datos funciona en otro sector.</w:t>
       </w:r>
     </w:p>
     <w:p>
@@ -9864,6 +9888,184 @@
             <w:r>
               <w:rPr>
                 <w:rFonts w:ascii="Arial" w:cs="Arial" w:eastAsia="Arial" w:hAnsi="Arial"/>
+                <w:b w:val="false"/>
+                <w:bCs w:val="false"/>
+                <w:sz w:val="17"/>
+                <w:szCs w:val="17"/>
+              </w:rPr>
+              <w:t xml:space="preserve">Memoria, comentarios de notebooks, documentación del uso de IA y skill</w:t>
+            </w:r>
+          </w:p>
+        </w:tc>
+        <w:tc>
+          <w:tcPr>
+            <w:tcW w:type="dxa" w:w="2300"/>
+            <w:tcBorders>
+              <w:top w:val="single" w:color="C9C9C9" w:sz="4"/>
+              <w:left w:val="single" w:color="C9C9C9" w:sz="4"/>
+              <w:bottom w:val="single" w:color="C9C9C9" w:sz="4"/>
+              <w:right w:val="single" w:color="C9C9C9" w:sz="4"/>
+            </w:tcBorders>
+            <w:tcMar>
+              <w:top w:type="dxa" w:w="50"/>
+              <w:left w:type="dxa" w:w="90"/>
+              <w:bottom w:type="dxa" w:w="50"/>
+              <w:right w:type="dxa" w:w="90"/>
+            </w:tcMar>
+          </w:tcPr>
+          <w:p>
+            <w:r>
+              <w:rPr>
+                <w:rFonts w:ascii="Arial" w:cs="Arial" w:eastAsia="Arial" w:hAnsi="Arial"/>
+                <w:b w:val="false"/>
+                <w:bCs w:val="false"/>
+                <w:sz w:val="17"/>
+                <w:szCs w:val="17"/>
+              </w:rPr>
+              <w:t xml:space="preserve">10 h</w:t>
+            </w:r>
+          </w:p>
+        </w:tc>
+        <w:tc>
+          <w:tcPr>
+            <w:tcW w:type="dxa" w:w="3038"/>
+            <w:tcBorders>
+              <w:top w:val="single" w:color="C9C9C9" w:sz="4"/>
+              <w:left w:val="single" w:color="C9C9C9" w:sz="4"/>
+              <w:bottom w:val="single" w:color="C9C9C9" w:sz="4"/>
+              <w:right w:val="single" w:color="C9C9C9" w:sz="4"/>
+            </w:tcBorders>
+            <w:tcMar>
+              <w:top w:type="dxa" w:w="50"/>
+              <w:left w:type="dxa" w:w="90"/>
+              <w:bottom w:type="dxa" w:w="50"/>
+              <w:right w:type="dxa" w:w="90"/>
+            </w:tcMar>
+          </w:tcPr>
+          <w:p>
+            <w:r>
+              <w:rPr>
+                <w:rFonts w:ascii="Arial" w:cs="Arial" w:eastAsia="Arial" w:hAnsi="Arial"/>
+                <w:b w:val="false"/>
+                <w:bCs w:val="false"/>
+                <w:sz w:val="17"/>
+                <w:szCs w:val="17"/>
+              </w:rPr>
+              <w:t xml:space="preserve">1,2 h</w:t>
+            </w:r>
+          </w:p>
+        </w:tc>
+      </w:tr>
+      <w:tr>
+        <w:tc>
+          <w:tcPr>
+            <w:tcW w:type="dxa" w:w="4300"/>
+            <w:tcBorders>
+              <w:top w:val="single" w:color="C9C9C9" w:sz="4"/>
+              <w:left w:val="single" w:color="C9C9C9" w:sz="4"/>
+              <w:bottom w:val="single" w:color="C9C9C9" w:sz="4"/>
+              <w:right w:val="single" w:color="C9C9C9" w:sz="4"/>
+            </w:tcBorders>
+            <w:tcMar>
+              <w:top w:type="dxa" w:w="50"/>
+              <w:left w:type="dxa" w:w="90"/>
+              <w:bottom w:type="dxa" w:w="50"/>
+              <w:right w:type="dxa" w:w="90"/>
+            </w:tcMar>
+          </w:tcPr>
+          <w:p>
+            <w:r>
+              <w:rPr>
+                <w:rFonts w:ascii="Arial" w:cs="Arial" w:eastAsia="Arial" w:hAnsi="Arial"/>
+                <w:b w:val="false"/>
+                <w:bCs w:val="false"/>
+                <w:sz w:val="17"/>
+                <w:szCs w:val="17"/>
+              </w:rPr>
+              <w:t xml:space="preserve">Seguimiento de la operación (comprobar ejecuciones y registrar evidencias)</w:t>
+            </w:r>
+          </w:p>
+        </w:tc>
+        <w:tc>
+          <w:tcPr>
+            <w:tcW w:type="dxa" w:w="2300"/>
+            <w:tcBorders>
+              <w:top w:val="single" w:color="C9C9C9" w:sz="4"/>
+              <w:left w:val="single" w:color="C9C9C9" w:sz="4"/>
+              <w:bottom w:val="single" w:color="C9C9C9" w:sz="4"/>
+              <w:right w:val="single" w:color="C9C9C9" w:sz="4"/>
+            </w:tcBorders>
+            <w:tcMar>
+              <w:top w:type="dxa" w:w="50"/>
+              <w:left w:type="dxa" w:w="90"/>
+              <w:bottom w:type="dxa" w:w="50"/>
+              <w:right w:type="dxa" w:w="90"/>
+            </w:tcMar>
+          </w:tcPr>
+          <w:p>
+            <w:r>
+              <w:rPr>
+                <w:rFonts w:ascii="Arial" w:cs="Arial" w:eastAsia="Arial" w:hAnsi="Arial"/>
+                <w:b w:val="false"/>
+                <w:bCs w:val="false"/>
+                <w:sz w:val="17"/>
+                <w:szCs w:val="17"/>
+              </w:rPr>
+              <w:t xml:space="preserve">0,7 h</w:t>
+            </w:r>
+          </w:p>
+        </w:tc>
+        <w:tc>
+          <w:tcPr>
+            <w:tcW w:type="dxa" w:w="3038"/>
+            <w:tcBorders>
+              <w:top w:val="single" w:color="C9C9C9" w:sz="4"/>
+              <w:left w:val="single" w:color="C9C9C9" w:sz="4"/>
+              <w:bottom w:val="single" w:color="C9C9C9" w:sz="4"/>
+              <w:right w:val="single" w:color="C9C9C9" w:sz="4"/>
+            </w:tcBorders>
+            <w:tcMar>
+              <w:top w:type="dxa" w:w="50"/>
+              <w:left w:type="dxa" w:w="90"/>
+              <w:bottom w:type="dxa" w:w="50"/>
+              <w:right w:type="dxa" w:w="90"/>
+            </w:tcMar>
+          </w:tcPr>
+          <w:p>
+            <w:r>
+              <w:rPr>
+                <w:rFonts w:ascii="Arial" w:cs="Arial" w:eastAsia="Arial" w:hAnsi="Arial"/>
+                <w:b w:val="false"/>
+                <w:bCs w:val="false"/>
+                <w:sz w:val="17"/>
+                <w:szCs w:val="17"/>
+              </w:rPr>
+              <w:t xml:space="preserve">0,7 h</w:t>
+            </w:r>
+          </w:p>
+        </w:tc>
+      </w:tr>
+      <w:tr>
+        <w:tc>
+          <w:tcPr>
+            <w:tcW w:type="dxa" w:w="4300"/>
+            <w:tcBorders>
+              <w:top w:val="single" w:color="C9C9C9" w:sz="4"/>
+              <w:left w:val="single" w:color="C9C9C9" w:sz="4"/>
+              <w:bottom w:val="single" w:color="C9C9C9" w:sz="4"/>
+              <w:right w:val="single" w:color="C9C9C9" w:sz="4"/>
+            </w:tcBorders>
+            <w:tcMar>
+              <w:top w:type="dxa" w:w="50"/>
+              <w:left w:type="dxa" w:w="90"/>
+              <w:bottom w:type="dxa" w:w="50"/>
+              <w:right w:type="dxa" w:w="90"/>
+            </w:tcMar>
+          </w:tcPr>
+          <w:p>
+            <w:r>
+              <w:rPr>
+                <w:rFonts w:ascii="Arial" w:cs="Arial" w:eastAsia="Arial" w:hAnsi="Arial"/>
                 <w:b/>
                 <w:bCs/>
                 <w:sz w:val="17"/>
@@ -9898,7 +10100,7 @@
                 <w:sz w:val="17"/>
                 <w:szCs w:val="17"/>
               </w:rPr>
-              <w:t xml:space="preserve">36 h</w:t>
+              <w:t xml:space="preserve">46,7 h</w:t>
             </w:r>
           </w:p>
         </w:tc>
@@ -9927,17 +10129,17 @@
                 <w:sz w:val="17"/>
                 <w:szCs w:val="17"/>
               </w:rPr>
-              <w:t xml:space="preserve">7,1 h</w:t>
-            </w:r>
-            <w:r>
-              <w:rPr>
-                <w:rFonts w:ascii="Arial" w:cs="Arial" w:eastAsia="Arial" w:hAnsi="Arial"/>
-                <w:b w:val="false"/>
-                <w:bCs w:val="false"/>
-                <w:sz w:val="17"/>
-                <w:szCs w:val="17"/>
-              </w:rPr>
-              <w:t xml:space="preserve"> (24/10 17:07 → 25/10 00:15)</w:t>
+              <w:t xml:space="preserve">9,0 h</w:t>
+            </w:r>
+            <w:r>
+              <w:rPr>
+                <w:rFonts w:ascii="Arial" w:cs="Arial" w:eastAsia="Arial" w:hAnsi="Arial"/>
+                <w:b w:val="false"/>
+                <w:bCs w:val="false"/>
+                <w:sz w:val="17"/>
+                <w:szCs w:val="17"/>
+              </w:rPr>
+              <w:t xml:space="preserve"> (24/10 17:07 → 25/10 01:10, más 25/10 08:03–08:20 y 09:32–10:15)</w:t>
             </w:r>
           </w:p>
         </w:tc>
@@ -9970,7 +10172,7 @@
           <w:sz w:val="20"/>
           <w:szCs w:val="20"/>
         </w:rPr>
-        <w:t xml:space="preserve"> Las horas con IA salen de las marcas de tiempo de la sesión de trabajo; su reparto por bloque es aproximado e incluye la revisión humana (ejecutar, comprobar, decidir). La columna sin IA es una </w:t>
+        <w:t xml:space="preserve"> Las horas con IA salen de las marcas de tiempo de las sesiones de trabajo; su reparto por bloque es aproximado e incluye la revisión humana (ejecutar, comprobar, decidir). El seguimiento de la operación cuesta lo mismo en los dos modos, porque lo hace la autora. Las sesiones de cierre (27–29/10) se sumarán al total antes de la entrega. La columna sin IA es una </w:t>
       </w:r>
       <w:r>
         <w:rPr>
@@ -10147,7 +10349,7 @@
                 <w:sz w:val="17"/>
                 <w:szCs w:val="17"/>
               </w:rPr>
-              <w:t xml:space="preserve">Horas ahorradas por ejecución (36 − 7,1)</w:t>
+              <w:t xml:space="preserve">Horas ahorradas por ejecución (46,7 − 9,0)</w:t>
             </w:r>
           </w:p>
         </w:tc>
@@ -10176,7 +10378,7 @@
                 <w:sz w:val="17"/>
                 <w:szCs w:val="17"/>
               </w:rPr>
-              <w:t xml:space="preserve">28,9 h</w:t>
+              <w:t xml:space="preserve">37,7 h</w:t>
             </w:r>
           </w:p>
         </w:tc>
@@ -10354,7 +10556,7 @@
                 <w:sz w:val="17"/>
                 <w:szCs w:val="17"/>
               </w:rPr>
-              <w:t xml:space="preserve">≈ 20 € (suscripción mensual de Claude prorrateada; Databricks Free Edition y GitHub: 0 €)</w:t>
+              <w:t xml:space="preserve">≈ 22 € (un mes de Claude Pro: 20 USD + IVA; Databricks Free Edition y GitHub: 0 €)</w:t>
             </w:r>
           </w:p>
         </w:tc>
@@ -10383,7 +10585,7 @@
                 <w:sz w:val="17"/>
                 <w:szCs w:val="17"/>
               </w:rPr>
-              <w:t xml:space="preserve">Supuesto: precio a confirmar por la autora</w:t>
+              <w:t xml:space="preserve">Medido: plan usado; importe según factura</w:t>
             </w:r>
           </w:p>
         </w:tc>
@@ -10532,7 +10734,7 @@
                 <w:sz w:val="17"/>
                 <w:szCs w:val="17"/>
               </w:rPr>
-              <w:t xml:space="preserve">(28,9 × 45 − 20) × 4 ≈ 5.122 €</w:t>
+              <w:t xml:space="preserve">(37,7 × 45 − 22) × 4 ≈ 6.698 €</w:t>
             </w:r>
           </w:p>
         </w:tc>
@@ -10833,6 +11035,85 @@
           <w:szCs w:val="20"/>
         </w:rPr>
         <w:t xml:space="preserve">Reescribir en Spark los pasos con pandas para recuperar el linaje completo, añadir más estaciones (Haro, Rioja Alta) y alertas por correo cuando falle un control crítico.</w:t>
+      </w:r>
+    </w:p>
+    <w:p>
+      <w:pPr>
+        <w:pStyle w:val="ListParagraph"/>
+        <w:numPr>
+          <w:ilvl w:val="0"/>
+          <w:numId w:val="2"/>
+        </w:numPr>
+        <w:spacing w:after="50" w:line="264"/>
+      </w:pPr>
+      <w:r>
+        <w:rPr>
+          <w:rFonts w:ascii="Arial" w:cs="Arial" w:eastAsia="Arial" w:hAnsi="Arial"/>
+          <w:sz w:val="20"/>
+          <w:szCs w:val="20"/>
+        </w:rPr>
+        <w:t xml:space="preserve">Con más tiempo, añadiría más fuentes de datos y capas de predicción, por ejemplo para estimar la demanda de vino o la capacidad de las bodegas. Los modelos se descartaron en este trabajo (D-06) porque no había datos suficientes para entrenarlos con garantías; más fuentes son la condición para recuperarlos.</w:t>
+      </w:r>
+    </w:p>
+    <w:p>
+      <w:pPr>
+        <w:pStyle w:val="Heading2"/>
+        <w:keepNext/>
+        <w:keepLines/>
+        <w:spacing w:after="80" w:before="160"/>
+      </w:pPr>
+      <w:r>
+        <w:rPr>
+          <w:rFonts w:ascii="Arial" w:cs="Arial" w:eastAsia="Arial" w:hAnsi="Arial"/>
+          <w:b/>
+          <w:bCs/>
+          <w:color w:val="333333"/>
+          <w:sz w:val="22"/>
+          <w:szCs w:val="22"/>
+        </w:rPr>
+        <w:t xml:space="preserve">Lo que me llevo</w:t>
+      </w:r>
+    </w:p>
+    <w:p>
+      <w:pPr>
+        <w:spacing w:after="100" w:line="276"/>
+        <w:jc w:val="both"/>
+      </w:pPr>
+      <w:r>
+        <w:rPr>
+          <w:rFonts w:ascii="Arial" w:cs="Arial" w:eastAsia="Arial" w:hAnsi="Arial"/>
+          <w:sz w:val="20"/>
+          <w:szCs w:val="20"/>
+        </w:rPr>
+        <w:t xml:space="preserve">El pipeline de agosto lo monté yo como material docente y, aunque no era del todo correcto, me dio la oportunidad de cacharrear con Databricks. No soy una profesional senior de data engineering y es normal tener errores. Para mí, detectar el fallo ha sido lo más valioso: me ha permitido mejorarlo y descubrir piezas que no tenía en el radar, como la capa de gobierno o desplegar el dashboard en Streamlit directamente en Databricks.</w:t>
+      </w:r>
+    </w:p>
+    <w:p>
+      <w:pPr>
+        <w:spacing w:after="100" w:line="276"/>
+        <w:jc w:val="both"/>
+      </w:pPr>
+      <w:r>
+        <w:rPr>
+          <w:rFonts w:ascii="Arial" w:cs="Arial" w:eastAsia="Arial" w:hAnsi="Arial"/>
+          <w:sz w:val="20"/>
+          <w:szCs w:val="20"/>
+        </w:rPr>
+        <w:t xml:space="preserve">Lo más difícil de trabajar con IA ha sido no dar por sentadas sus respuestas. Cuesta no creerse directamente que todo es verídico, porque no se nos enseña a cuestionarla. Por eso este trabajo registra cada verificación y también los casos en que la IA se equivocó (sección 7).</w:t>
+      </w:r>
+    </w:p>
+    <w:p>
+      <w:pPr>
+        <w:spacing w:after="100" w:line="276"/>
+        <w:jc w:val="both"/>
+      </w:pPr>
+      <w:r>
+        <w:rPr>
+          <w:rFonts w:ascii="Arial" w:cs="Arial" w:eastAsia="Arial" w:hAnsi="Arial"/>
+          <w:sz w:val="20"/>
+          <w:szCs w:val="20"/>
+        </w:rPr>
+        <w:t xml:space="preserve">En el día a día, usada como copiloto, me permite aprender cosas nuevas sin tener experiencia previa en ellas y profundizar, aunque no sea a nivel profesional. Creo que es una herramienta muy potente, siempre que se trabaje con reglas y comprobando lo que propone.</w:t>
       </w:r>
     </w:p>
     <w:p>
@@ -11201,7 +11482,7 @@
                 <w:sz w:val="17"/>
                 <w:szCs w:val="17"/>
               </w:rPr>
-              <w:t xml:space="preserve">Índice de evidencias e incidencias (E-01 a E-26, INC-01 a INC-06)</w:t>
+              <w:t xml:space="preserve">Índice de evidencias e incidencias (E-01 a E-29, INC-01 a INC-06)</w:t>
             </w:r>
           </w:p>
         </w:tc>

</xml_diff>

<commit_message>
Evidencias E-31 y E-32 (primera carga con datos nuevos de MITECO, 28/10) y tabla 5.3
Co-Authored-By: Claude Opus 5.5 <noreply@anthropic.com>
Claude-Session: https://claude.ai/code/session_01MGcbUB4LTJrt847y66pmRH
</commit_message>
<xml_diff>
--- a/docs/memoria/TFM_Agua_y_vinedo_La_Rioja.docx
+++ b/docs/memoria/TFM_Agua_y_vinedo_La_Rioja.docx
@@ -6752,7 +6752,7 @@
                 <w:sz w:val="17"/>
                 <w:szCs w:val="17"/>
               </w:rPr>
-              <w:t xml:space="preserve">27–28/10</w:t>
+              <w:t xml:space="preserve">26/10 y 27/10 07:37</w:t>
             </w:r>
           </w:p>
         </w:tc>
@@ -6781,7 +6781,7 @@
                 <w:sz w:val="17"/>
                 <w:szCs w:val="17"/>
               </w:rPr>
-              <w:t xml:space="preserve">Job programado · publicación semanal de MITECO</w:t>
+              <w:t xml:space="preserve">Job programado</w:t>
             </w:r>
           </w:p>
         </w:tc>
@@ -6810,7 +6810,7 @@
                 <w:sz w:val="17"/>
                 <w:szCs w:val="17"/>
               </w:rPr>
-              <w:t xml:space="preserve">[completar]</w:t>
+              <w:t xml:space="preserve">OK</w:t>
             </w:r>
           </w:p>
         </w:tc>
@@ -6839,7 +6839,7 @@
                 <w:sz w:val="17"/>
                 <w:szCs w:val="17"/>
               </w:rPr>
-              <w:t xml:space="preserve">[nuevo fichero]</w:t>
+              <w:t xml:space="preserve">Sin cambios</w:t>
             </w:r>
           </w:p>
         </w:tc>
@@ -6868,7 +6868,7 @@
                 <w:sz w:val="17"/>
                 <w:szCs w:val="17"/>
               </w:rPr>
-              <w:t xml:space="preserve">[completar]</w:t>
+              <w:t xml:space="preserve">14/14, 0 avisos</w:t>
             </w:r>
           </w:p>
         </w:tc>
@@ -6897,7 +6897,7 @@
                 <w:sz w:val="17"/>
                 <w:szCs w:val="17"/>
               </w:rPr>
-              <w:t xml:space="preserve">[completar]</w:t>
+              <w:t xml:space="preserve">OK (6 min 5 s y 6 min 28 s)</w:t>
             </w:r>
           </w:p>
         </w:tc>
@@ -6928,6 +6928,182 @@
                 <w:sz w:val="17"/>
                 <w:szCs w:val="17"/>
               </w:rPr>
+              <w:t xml:space="preserve">28/10 07:37</w:t>
+            </w:r>
+          </w:p>
+        </w:tc>
+        <w:tc>
+          <w:tcPr>
+            <w:tcW w:type="dxa" w:w="2500"/>
+            <w:tcBorders>
+              <w:top w:val="single" w:color="C9C9C9" w:sz="4"/>
+              <w:left w:val="single" w:color="C9C9C9" w:sz="4"/>
+              <w:bottom w:val="single" w:color="C9C9C9" w:sz="4"/>
+              <w:right w:val="single" w:color="C9C9C9" w:sz="4"/>
+            </w:tcBorders>
+            <w:tcMar>
+              <w:top w:type="dxa" w:w="50"/>
+              <w:left w:type="dxa" w:w="90"/>
+              <w:bottom w:type="dxa" w:w="50"/>
+              <w:right w:type="dxa" w:w="90"/>
+            </w:tcMar>
+          </w:tcPr>
+          <w:p>
+            <w:r>
+              <w:rPr>
+                <w:rFonts w:ascii="Arial" w:cs="Arial" w:eastAsia="Arial" w:hAnsi="Arial"/>
+                <w:b w:val="false"/>
+                <w:bCs w:val="false"/>
+                <w:sz w:val="17"/>
+                <w:szCs w:val="17"/>
+              </w:rPr>
+              <w:t xml:space="preserve">Job programado · MITECO publica la semana del 27/10</w:t>
+            </w:r>
+          </w:p>
+        </w:tc>
+        <w:tc>
+          <w:tcPr>
+            <w:tcW w:type="dxa" w:w="1300"/>
+            <w:tcBorders>
+              <w:top w:val="single" w:color="C9C9C9" w:sz="4"/>
+              <w:left w:val="single" w:color="C9C9C9" w:sz="4"/>
+              <w:bottom w:val="single" w:color="C9C9C9" w:sz="4"/>
+              <w:right w:val="single" w:color="C9C9C9" w:sz="4"/>
+            </w:tcBorders>
+            <w:tcMar>
+              <w:top w:type="dxa" w:w="50"/>
+              <w:left w:type="dxa" w:w="90"/>
+              <w:bottom w:type="dxa" w:w="50"/>
+              <w:right w:type="dxa" w:w="90"/>
+            </w:tcMar>
+          </w:tcPr>
+          <w:p>
+            <w:r>
+              <w:rPr>
+                <w:rFonts w:ascii="Arial" w:cs="Arial" w:eastAsia="Arial" w:hAnsi="Arial"/>
+                <w:b w:val="false"/>
+                <w:bCs w:val="false"/>
+                <w:sz w:val="17"/>
+                <w:szCs w:val="17"/>
+              </w:rPr>
+              <w:t xml:space="preserve">OK (último dato 24/10)</w:t>
+            </w:r>
+          </w:p>
+        </w:tc>
+        <w:tc>
+          <w:tcPr>
+            <w:tcW w:type="dxa" w:w="1500"/>
+            <w:tcBorders>
+              <w:top w:val="single" w:color="C9C9C9" w:sz="4"/>
+              <w:left w:val="single" w:color="C9C9C9" w:sz="4"/>
+              <w:bottom w:val="single" w:color="C9C9C9" w:sz="4"/>
+              <w:right w:val="single" w:color="C9C9C9" w:sz="4"/>
+            </w:tcBorders>
+            <w:tcMar>
+              <w:top w:type="dxa" w:w="50"/>
+              <w:left w:type="dxa" w:w="90"/>
+              <w:bottom w:type="dxa" w:w="50"/>
+              <w:right w:type="dxa" w:w="90"/>
+            </w:tcMar>
+          </w:tcPr>
+          <w:p>
+            <w:r>
+              <w:rPr>
+                <w:rFonts w:ascii="Arial" w:cs="Arial" w:eastAsia="Arial" w:hAnsi="Arial"/>
+                <w:b w:val="false"/>
+                <w:bCs w:val="false"/>
+                <w:sz w:val="17"/>
+                <w:szCs w:val="17"/>
+              </w:rPr>
+              <w:t xml:space="preserve">Fichero nuevo: +76 lecturas</w:t>
+            </w:r>
+          </w:p>
+        </w:tc>
+        <w:tc>
+          <w:tcPr>
+            <w:tcW w:type="dxa" w:w="1100"/>
+            <w:tcBorders>
+              <w:top w:val="single" w:color="C9C9C9" w:sz="4"/>
+              <w:left w:val="single" w:color="C9C9C9" w:sz="4"/>
+              <w:bottom w:val="single" w:color="C9C9C9" w:sz="4"/>
+              <w:right w:val="single" w:color="C9C9C9" w:sz="4"/>
+            </w:tcBorders>
+            <w:tcMar>
+              <w:top w:type="dxa" w:w="50"/>
+              <w:left w:type="dxa" w:w="90"/>
+              <w:bottom w:type="dxa" w:w="50"/>
+              <w:right w:type="dxa" w:w="90"/>
+            </w:tcMar>
+          </w:tcPr>
+          <w:p>
+            <w:r>
+              <w:rPr>
+                <w:rFonts w:ascii="Arial" w:cs="Arial" w:eastAsia="Arial" w:hAnsi="Arial"/>
+                <w:b w:val="false"/>
+                <w:bCs w:val="false"/>
+                <w:sz w:val="17"/>
+                <w:szCs w:val="17"/>
+              </w:rPr>
+              <w:t xml:space="preserve">14/14, 0 avisos</w:t>
+            </w:r>
+          </w:p>
+        </w:tc>
+        <w:tc>
+          <w:tcPr>
+            <w:tcW w:type="dxa" w:w="1738"/>
+            <w:tcBorders>
+              <w:top w:val="single" w:color="C9C9C9" w:sz="4"/>
+              <w:left w:val="single" w:color="C9C9C9" w:sz="4"/>
+              <w:bottom w:val="single" w:color="C9C9C9" w:sz="4"/>
+              <w:right w:val="single" w:color="C9C9C9" w:sz="4"/>
+            </w:tcBorders>
+            <w:tcMar>
+              <w:top w:type="dxa" w:w="50"/>
+              <w:left w:type="dxa" w:w="90"/>
+              <w:bottom w:type="dxa" w:w="50"/>
+              <w:right w:type="dxa" w:w="90"/>
+            </w:tcMar>
+          </w:tcPr>
+          <w:p>
+            <w:r>
+              <w:rPr>
+                <w:rFonts w:ascii="Arial" w:cs="Arial" w:eastAsia="Arial" w:hAnsi="Arial"/>
+                <w:b w:val="false"/>
+                <w:bCs w:val="false"/>
+                <w:sz w:val="17"/>
+                <w:szCs w:val="17"/>
+              </w:rPr>
+              <w:t xml:space="preserve">OK (6 min 57 s)</w:t>
+            </w:r>
+          </w:p>
+        </w:tc>
+      </w:tr>
+      <w:tr>
+        <w:tc>
+          <w:tcPr>
+            <w:tcW w:type="dxa" w:w="1500"/>
+            <w:tcBorders>
+              <w:top w:val="single" w:color="C9C9C9" w:sz="4"/>
+              <w:left w:val="single" w:color="C9C9C9" w:sz="4"/>
+              <w:bottom w:val="single" w:color="C9C9C9" w:sz="4"/>
+              <w:right w:val="single" w:color="C9C9C9" w:sz="4"/>
+            </w:tcBorders>
+            <w:tcMar>
+              <w:top w:type="dxa" w:w="50"/>
+              <w:left w:type="dxa" w:w="90"/>
+              <w:bottom w:type="dxa" w:w="50"/>
+              <w:right w:type="dxa" w:w="90"/>
+            </w:tcMar>
+          </w:tcPr>
+          <w:p>
+            <w:r>
+              <w:rPr>
+                <w:rFonts w:ascii="Arial" w:cs="Arial" w:eastAsia="Arial" w:hAnsi="Arial"/>
+                <w:b w:val="false"/>
+                <w:bCs w:val="false"/>
+                <w:sz w:val="17"/>
+                <w:szCs w:val="17"/>
+              </w:rPr>
               <w:t xml:space="preserve">29/10 07:37</w:t>
             </w:r>
           </w:p>
@@ -7079,6 +7255,36 @@
         </w:tc>
       </w:tr>
     </w:tbl>
+    <w:p>
+      <w:pPr>
+        <w:spacing w:after="100" w:line="276"/>
+        <w:jc w:val="both"/>
+      </w:pPr>
+    </w:p>
+    <w:p>
+      <w:pPr>
+        <w:spacing w:after="100" w:line="276"/>
+        <w:jc w:val="both"/>
+      </w:pPr>
+      <w:r>
+        <w:rPr>
+          <w:rFonts w:ascii="Arial" w:cs="Arial" w:eastAsia="Arial" w:hAnsi="Arial"/>
+          <w:b/>
+          <w:bCs/>
+          <w:sz w:val="20"/>
+          <w:szCs w:val="20"/>
+        </w:rPr>
+        <w:t xml:space="preserve">La carga del 28/10 es la prueba de operación más completa.</w:t>
+      </w:r>
+      <w:r>
+        <w:rPr>
+          <w:rFonts w:ascii="Arial" w:cs="Arial" w:eastAsia="Arial" w:hAnsi="Arial"/>
+          <w:sz w:val="20"/>
+          <w:szCs w:val="20"/>
+        </w:rPr>
+        <w:t xml:space="preserve"> MITECO publicó la semana del 27/10 y el Job la cargó sin intervención: la huella SHA-256 del fichero cambió (tras tres días de «sin cambios»), bronze recibió de nuevo el histórico del Ebro y silver pasó de 124.701 a 124.777 lecturas. La deduplicación dejó una sola lectura por embalse y fecha (unicidad 0), la conciliación siguió a 0 y la frescura de MITECO bajó de 5 días a 1 (E-31, E-32).</w:t>
+      </w:r>
+    </w:p>
     <w:tbl>
       <w:tblPr>
         <w:tblW w:type="dxa" w:w="9638"/>
@@ -11482,7 +11688,7 @@
                 <w:sz w:val="17"/>
                 <w:szCs w:val="17"/>
               </w:rPr>
-              <w:t xml:space="preserve">Índice de evidencias e incidencias (E-01 a E-29, INC-01 a INC-06)</w:t>
+              <w:t xml:space="preserve">Índice de evidencias e incidencias (E-01 a E-32, INC-01 a INC-06)</w:t>
             </w:r>
           </w:p>
         </w:tc>

</xml_diff>

<commit_message>
Memoria: tabla 5.3 cerrada con datos reales hasta el 28/10
Co-Authored-By: Claude Opus 5.5 <noreply@anthropic.com>
Claude-Session: https://claude.ai/code/session_01MGcbUB4LTJrt847y66pmRH
</commit_message>
<xml_diff>
--- a/docs/memoria/TFM_Agua_y_vinedo_La_Rioja.docx
+++ b/docs/memoria/TFM_Agua_y_vinedo_La_Rioja.docx
@@ -7074,182 +7074,6 @@
                 <w:szCs w:val="17"/>
               </w:rPr>
               <w:t xml:space="preserve">OK (6 min 57 s)</w:t>
-            </w:r>
-          </w:p>
-        </w:tc>
-      </w:tr>
-      <w:tr>
-        <w:tc>
-          <w:tcPr>
-            <w:tcW w:type="dxa" w:w="1500"/>
-            <w:tcBorders>
-              <w:top w:val="single" w:color="C9C9C9" w:sz="4"/>
-              <w:left w:val="single" w:color="C9C9C9" w:sz="4"/>
-              <w:bottom w:val="single" w:color="C9C9C9" w:sz="4"/>
-              <w:right w:val="single" w:color="C9C9C9" w:sz="4"/>
-            </w:tcBorders>
-            <w:tcMar>
-              <w:top w:type="dxa" w:w="50"/>
-              <w:left w:type="dxa" w:w="90"/>
-              <w:bottom w:type="dxa" w:w="50"/>
-              <w:right w:type="dxa" w:w="90"/>
-            </w:tcMar>
-          </w:tcPr>
-          <w:p>
-            <w:r>
-              <w:rPr>
-                <w:rFonts w:ascii="Arial" w:cs="Arial" w:eastAsia="Arial" w:hAnsi="Arial"/>
-                <w:b w:val="false"/>
-                <w:bCs w:val="false"/>
-                <w:sz w:val="17"/>
-                <w:szCs w:val="17"/>
-              </w:rPr>
-              <w:t xml:space="preserve">29/10 07:37</w:t>
-            </w:r>
-          </w:p>
-        </w:tc>
-        <w:tc>
-          <w:tcPr>
-            <w:tcW w:type="dxa" w:w="2500"/>
-            <w:tcBorders>
-              <w:top w:val="single" w:color="C9C9C9" w:sz="4"/>
-              <w:left w:val="single" w:color="C9C9C9" w:sz="4"/>
-              <w:bottom w:val="single" w:color="C9C9C9" w:sz="4"/>
-              <w:right w:val="single" w:color="C9C9C9" w:sz="4"/>
-            </w:tcBorders>
-            <w:tcMar>
-              <w:top w:type="dxa" w:w="50"/>
-              <w:left w:type="dxa" w:w="90"/>
-              <w:bottom w:type="dxa" w:w="50"/>
-              <w:right w:type="dxa" w:w="90"/>
-            </w:tcMar>
-          </w:tcPr>
-          <w:p>
-            <w:r>
-              <w:rPr>
-                <w:rFonts w:ascii="Arial" w:cs="Arial" w:eastAsia="Arial" w:hAnsi="Arial"/>
-                <w:b w:val="false"/>
-                <w:bCs w:val="false"/>
-                <w:sz w:val="17"/>
-                <w:szCs w:val="17"/>
-              </w:rPr>
-              <w:t xml:space="preserve">Job programado (última antes de entregar)</w:t>
-            </w:r>
-          </w:p>
-        </w:tc>
-        <w:tc>
-          <w:tcPr>
-            <w:tcW w:type="dxa" w:w="1300"/>
-            <w:tcBorders>
-              <w:top w:val="single" w:color="C9C9C9" w:sz="4"/>
-              <w:left w:val="single" w:color="C9C9C9" w:sz="4"/>
-              <w:bottom w:val="single" w:color="C9C9C9" w:sz="4"/>
-              <w:right w:val="single" w:color="C9C9C9" w:sz="4"/>
-            </w:tcBorders>
-            <w:tcMar>
-              <w:top w:type="dxa" w:w="50"/>
-              <w:left w:type="dxa" w:w="90"/>
-              <w:bottom w:type="dxa" w:w="50"/>
-              <w:right w:type="dxa" w:w="90"/>
-            </w:tcMar>
-          </w:tcPr>
-          <w:p>
-            <w:r>
-              <w:rPr>
-                <w:rFonts w:ascii="Arial" w:cs="Arial" w:eastAsia="Arial" w:hAnsi="Arial"/>
-                <w:b w:val="false"/>
-                <w:bCs w:val="false"/>
-                <w:sz w:val="17"/>
-                <w:szCs w:val="17"/>
-              </w:rPr>
-              <w:t xml:space="preserve">[completar]</w:t>
-            </w:r>
-          </w:p>
-        </w:tc>
-        <w:tc>
-          <w:tcPr>
-            <w:tcW w:type="dxa" w:w="1500"/>
-            <w:tcBorders>
-              <w:top w:val="single" w:color="C9C9C9" w:sz="4"/>
-              <w:left w:val="single" w:color="C9C9C9" w:sz="4"/>
-              <w:bottom w:val="single" w:color="C9C9C9" w:sz="4"/>
-              <w:right w:val="single" w:color="C9C9C9" w:sz="4"/>
-            </w:tcBorders>
-            <w:tcMar>
-              <w:top w:type="dxa" w:w="50"/>
-              <w:left w:type="dxa" w:w="90"/>
-              <w:bottom w:type="dxa" w:w="50"/>
-              <w:right w:type="dxa" w:w="90"/>
-            </w:tcMar>
-          </w:tcPr>
-          <w:p>
-            <w:r>
-              <w:rPr>
-                <w:rFonts w:ascii="Arial" w:cs="Arial" w:eastAsia="Arial" w:hAnsi="Arial"/>
-                <w:b w:val="false"/>
-                <w:bCs w:val="false"/>
-                <w:sz w:val="17"/>
-                <w:szCs w:val="17"/>
-              </w:rPr>
-              <w:t xml:space="preserve">[completar]</w:t>
-            </w:r>
-          </w:p>
-        </w:tc>
-        <w:tc>
-          <w:tcPr>
-            <w:tcW w:type="dxa" w:w="1100"/>
-            <w:tcBorders>
-              <w:top w:val="single" w:color="C9C9C9" w:sz="4"/>
-              <w:left w:val="single" w:color="C9C9C9" w:sz="4"/>
-              <w:bottom w:val="single" w:color="C9C9C9" w:sz="4"/>
-              <w:right w:val="single" w:color="C9C9C9" w:sz="4"/>
-            </w:tcBorders>
-            <w:tcMar>
-              <w:top w:type="dxa" w:w="50"/>
-              <w:left w:type="dxa" w:w="90"/>
-              <w:bottom w:type="dxa" w:w="50"/>
-              <w:right w:type="dxa" w:w="90"/>
-            </w:tcMar>
-          </w:tcPr>
-          <w:p>
-            <w:r>
-              <w:rPr>
-                <w:rFonts w:ascii="Arial" w:cs="Arial" w:eastAsia="Arial" w:hAnsi="Arial"/>
-                <w:b w:val="false"/>
-                <w:bCs w:val="false"/>
-                <w:sz w:val="17"/>
-                <w:szCs w:val="17"/>
-              </w:rPr>
-              <w:t xml:space="preserve">[completar]</w:t>
-            </w:r>
-          </w:p>
-        </w:tc>
-        <w:tc>
-          <w:tcPr>
-            <w:tcW w:type="dxa" w:w="1738"/>
-            <w:tcBorders>
-              <w:top w:val="single" w:color="C9C9C9" w:sz="4"/>
-              <w:left w:val="single" w:color="C9C9C9" w:sz="4"/>
-              <w:bottom w:val="single" w:color="C9C9C9" w:sz="4"/>
-              <w:right w:val="single" w:color="C9C9C9" w:sz="4"/>
-            </w:tcBorders>
-            <w:tcMar>
-              <w:top w:type="dxa" w:w="50"/>
-              <w:left w:type="dxa" w:w="90"/>
-              <w:bottom w:type="dxa" w:w="50"/>
-              <w:right w:type="dxa" w:w="90"/>
-            </w:tcMar>
-          </w:tcPr>
-          <w:p>
-            <w:r>
-              <w:rPr>
-                <w:rFonts w:ascii="Arial" w:cs="Arial" w:eastAsia="Arial" w:hAnsi="Arial"/>
-                <w:b w:val="false"/>
-                <w:bCs w:val="false"/>
-                <w:sz w:val="17"/>
-                <w:szCs w:val="17"/>
-              </w:rPr>
-              <w:t xml:space="preserve">[completar]</w:t>
             </w:r>
           </w:p>
         </w:tc>

</xml_diff>

<commit_message>
Memoria: horas finales (revisión de la autora 5 h) y ROI recalculado
Co-Authored-By: Claude Opus 5.5 <noreply@anthropic.com>
Claude-Session: https://claude.ai/code/session_01MGcbUB4LTJrt847y66pmRH
</commit_message>
<xml_diff>
--- a/docs/memoria/TFM_Agua_y_vinedo_La_Rioja.docx
+++ b/docs/memoria/TFM_Agua_y_vinedo_La_Rioja.docx
@@ -10012,7 +10012,7 @@
                 <w:sz w:val="17"/>
                 <w:szCs w:val="17"/>
               </w:rPr>
-              <w:t xml:space="preserve">Seguimiento de la operación (comprobar ejecuciones y registrar evidencias)</w:t>
+              <w:t xml:space="preserve">Revisión y redacción final de la memoria (autora)</w:t>
             </w:r>
           </w:p>
         </w:tc>
@@ -10041,7 +10041,7 @@
                 <w:sz w:val="17"/>
                 <w:szCs w:val="17"/>
               </w:rPr>
-              <w:t xml:space="preserve">0,7 h</w:t>
+              <w:t xml:space="preserve">incluida arriba</w:t>
             </w:r>
           </w:p>
         </w:tc>
@@ -10070,7 +10070,7 @@
                 <w:sz w:val="17"/>
                 <w:szCs w:val="17"/>
               </w:rPr>
-              <w:t xml:space="preserve">0,7 h</w:t>
+              <w:t xml:space="preserve">5 h</w:t>
             </w:r>
           </w:p>
         </w:tc>
@@ -10096,6 +10096,95 @@
             <w:r>
               <w:rPr>
                 <w:rFonts w:ascii="Arial" w:cs="Arial" w:eastAsia="Arial" w:hAnsi="Arial"/>
+                <w:b w:val="false"/>
+                <w:bCs w:val="false"/>
+                <w:sz w:val="17"/>
+                <w:szCs w:val="17"/>
+              </w:rPr>
+              <w:t xml:space="preserve">Seguimiento de la operación (comprobar ejecuciones y registrar evidencias)</w:t>
+            </w:r>
+          </w:p>
+        </w:tc>
+        <w:tc>
+          <w:tcPr>
+            <w:tcW w:type="dxa" w:w="2300"/>
+            <w:tcBorders>
+              <w:top w:val="single" w:color="C9C9C9" w:sz="4"/>
+              <w:left w:val="single" w:color="C9C9C9" w:sz="4"/>
+              <w:bottom w:val="single" w:color="C9C9C9" w:sz="4"/>
+              <w:right w:val="single" w:color="C9C9C9" w:sz="4"/>
+            </w:tcBorders>
+            <w:tcMar>
+              <w:top w:type="dxa" w:w="50"/>
+              <w:left w:type="dxa" w:w="90"/>
+              <w:bottom w:type="dxa" w:w="50"/>
+              <w:right w:type="dxa" w:w="90"/>
+            </w:tcMar>
+          </w:tcPr>
+          <w:p>
+            <w:r>
+              <w:rPr>
+                <w:rFonts w:ascii="Arial" w:cs="Arial" w:eastAsia="Arial" w:hAnsi="Arial"/>
+                <w:b w:val="false"/>
+                <w:bCs w:val="false"/>
+                <w:sz w:val="17"/>
+                <w:szCs w:val="17"/>
+              </w:rPr>
+              <w:t xml:space="preserve">1,2 h</w:t>
+            </w:r>
+          </w:p>
+        </w:tc>
+        <w:tc>
+          <w:tcPr>
+            <w:tcW w:type="dxa" w:w="3038"/>
+            <w:tcBorders>
+              <w:top w:val="single" w:color="C9C9C9" w:sz="4"/>
+              <w:left w:val="single" w:color="C9C9C9" w:sz="4"/>
+              <w:bottom w:val="single" w:color="C9C9C9" w:sz="4"/>
+              <w:right w:val="single" w:color="C9C9C9" w:sz="4"/>
+            </w:tcBorders>
+            <w:tcMar>
+              <w:top w:type="dxa" w:w="50"/>
+              <w:left w:type="dxa" w:w="90"/>
+              <w:bottom w:type="dxa" w:w="50"/>
+              <w:right w:type="dxa" w:w="90"/>
+            </w:tcMar>
+          </w:tcPr>
+          <w:p>
+            <w:r>
+              <w:rPr>
+                <w:rFonts w:ascii="Arial" w:cs="Arial" w:eastAsia="Arial" w:hAnsi="Arial"/>
+                <w:b w:val="false"/>
+                <w:bCs w:val="false"/>
+                <w:sz w:val="17"/>
+                <w:szCs w:val="17"/>
+              </w:rPr>
+              <w:t xml:space="preserve">1,2 h</w:t>
+            </w:r>
+          </w:p>
+        </w:tc>
+      </w:tr>
+      <w:tr>
+        <w:tc>
+          <w:tcPr>
+            <w:tcW w:type="dxa" w:w="4300"/>
+            <w:tcBorders>
+              <w:top w:val="single" w:color="C9C9C9" w:sz="4"/>
+              <w:left w:val="single" w:color="C9C9C9" w:sz="4"/>
+              <w:bottom w:val="single" w:color="C9C9C9" w:sz="4"/>
+              <w:right w:val="single" w:color="C9C9C9" w:sz="4"/>
+            </w:tcBorders>
+            <w:tcMar>
+              <w:top w:type="dxa" w:w="50"/>
+              <w:left w:type="dxa" w:w="90"/>
+              <w:bottom w:type="dxa" w:w="50"/>
+              <w:right w:type="dxa" w:w="90"/>
+            </w:tcMar>
+          </w:tcPr>
+          <w:p>
+            <w:r>
+              <w:rPr>
+                <w:rFonts w:ascii="Arial" w:cs="Arial" w:eastAsia="Arial" w:hAnsi="Arial"/>
                 <w:b/>
                 <w:bCs/>
                 <w:sz w:val="17"/>
@@ -10130,7 +10219,7 @@
                 <w:sz w:val="17"/>
                 <w:szCs w:val="17"/>
               </w:rPr>
-              <w:t xml:space="preserve">46,7 h</w:t>
+              <w:t xml:space="preserve">47,2 h</w:t>
             </w:r>
           </w:p>
         </w:tc>
@@ -10159,17 +10248,7 @@
                 <w:sz w:val="17"/>
                 <w:szCs w:val="17"/>
               </w:rPr>
-              <w:t xml:space="preserve">9,0 h</w:t>
-            </w:r>
-            <w:r>
-              <w:rPr>
-                <w:rFonts w:ascii="Arial" w:cs="Arial" w:eastAsia="Arial" w:hAnsi="Arial"/>
-                <w:b w:val="false"/>
-                <w:bCs w:val="false"/>
-                <w:sz w:val="17"/>
-                <w:szCs w:val="17"/>
-              </w:rPr>
-              <w:t xml:space="preserve"> (24/10 17:07 → 25/10 01:10, más 25/10 08:03–08:20 y 09:32–10:15)</w:t>
+              <w:t xml:space="preserve">14,5 h</w:t>
             </w:r>
           </w:p>
         </w:tc>
@@ -10202,7 +10281,7 @@
           <w:sz w:val="20"/>
           <w:szCs w:val="20"/>
         </w:rPr>
-        <w:t xml:space="preserve"> Las horas con IA salen de las marcas de tiempo de las sesiones de trabajo; su reparto por bloque es aproximado e incluye la revisión humana (ejecutar, comprobar, decidir). El seguimiento de la operación cuesta lo mismo en los dos modos, porque lo hace la autora. Las sesiones de cierre (27–29/10) se sumarán al total antes de la entrega. La columna sin IA es una </w:t>
+        <w:t xml:space="preserve"> Las horas con IA salen de las marcas de tiempo de las sesiones de trabajo; su reparto por bloque es aproximado e incluye la revisión humana (ejecutar, comprobar, decidir). El seguimiento de la operación cuesta lo mismo en los dos modos, porque lo hace la autora. La revisión final de la memoria (5 h) la hizo la autora sin asistente y cuenta íntegra en el modo con IA. La columna sin IA es una </w:t>
       </w:r>
       <w:r>
         <w:rPr>
@@ -10379,7 +10458,7 @@
                 <w:sz w:val="17"/>
                 <w:szCs w:val="17"/>
               </w:rPr>
-              <w:t xml:space="preserve">Horas ahorradas por ejecución (46,7 − 9,0)</w:t>
+              <w:t xml:space="preserve">Horas ahorradas por ejecución (47,2 − 14,5)</w:t>
             </w:r>
           </w:p>
         </w:tc>
@@ -10408,7 +10487,7 @@
                 <w:sz w:val="17"/>
                 <w:szCs w:val="17"/>
               </w:rPr>
-              <w:t xml:space="preserve">37,7 h</w:t>
+              <w:t xml:space="preserve">32,7 h</w:t>
             </w:r>
           </w:p>
         </w:tc>
@@ -10764,7 +10843,7 @@
                 <w:sz w:val="17"/>
                 <w:szCs w:val="17"/>
               </w:rPr>
-              <w:t xml:space="preserve">(37,7 × 45 − 22) × 4 ≈ 6.698 €</w:t>
+              <w:t xml:space="preserve">(32,7 × 45 − 22) × 4 ≈ 5.798 €</w:t>
             </w:r>
           </w:p>
         </w:tc>

</xml_diff>